<commit_message>
Rewrite all Turkish for natural fluency (teammate flagged literal translation)
A native speaker noted the Turkish read like machine translation. Did a
full fluency pass across every TR document — Arciel's TR presentation +
slides (full rewrites) and the Turkish halves of Ayşegül's bilingual
presentation + slides — keeping the English untouched.

Replaced calqued hyphen-compounds and word-for-word constructions with
natural Turkish phrasing/word order, while keeping standard English CS
terms (RLS, RPC, payload, FOR UPDATE SKIP LOCKED, PDF.js, overlay…).
Examples: "duvar-saati bütçesi"→"süre sınırı", "güven-kapılı
yönlendirme"→"güvene göre yönlendirme", "kapı tutmayan"→"engellemeyen",
"şelale yok"→"ardışık bekleme yok", "yer paylaşımı"→"overlay",
"önce-kesinlik"→"önce kesinlik", "tuvalini çizmeden"→"canvas'ını
çizmeden". DOCX re-exported; calque sweep clean.

Co-Authored-By: Claude Opus 4.8 <noreply@anthropic.com>
</commit_message>
<xml_diff>
--- a/docs/defense/docx/Arciel_Baez_Zamora_Slides_TR.docx
+++ b/docs/defense/docx/Arciel_Baez_Zamora_Slides_TR.docx
@@ -32,9 +32,9 @@
       <w:pPr>
         <w:pStyle w:val="Heading1"/>
       </w:pPr>
-      <w:bookmarkStart w:id="20" w:name="Xd63a50bae1437f6f39f00594896972955095a40"/>
-      <w:r>
-        <w:t xml:space="preserve">OpenNutri — Arciel Aliognis Baez Zamora — Savunma Sunumu (slayt-hazır, Türkçe)</w:t>
+      <w:bookmarkStart w:id="20" w:name="X8f7ec4c6c780dcc35b3ff52890a2ff056b51571"/>
+      <w:r>
+        <w:t xml:space="preserve">OpenNutri — Arciel Aliognis Baez Zamora — Savunma Sunumu (slayt taslağı, Türkçe)</w:t>
       </w:r>
       <w:bookmarkEnd w:id="20"/>
     </w:p>
@@ -52,7 +52,7 @@
         <w:t xml:space="preserve"> </w:t>
       </w:r>
       <w:r>
-        <w:t xml:space="preserve">Arciel Baez Zamora’nın bireysel savunma sunumu (backend) için slayt-slayt bir metin. Tam metin</w:t>
+        <w:t xml:space="preserve">Arciel Baez Zamora’nın bireysel savunma sunumu (backend) için slayt slayt bir taslak. Tam metin olan</w:t>
       </w:r>
       <w:r>
         <w:t xml:space="preserve"> </w:t>
@@ -64,7 +64,7 @@
         <w:t xml:space="preserve">Arciel_Baez_Zamora_Presentation_TR.md</w:t>
       </w:r>
       <w:r>
-        <w:t xml:space="preserve">’den türetilmiştir; buradaki metin daha hafiftir — ana fikirler artı yüksek sesle söylemeye değer ayrıntılar. İngilizce slayt destesi ayrı bir dosyadadır:</w:t>
+        <w:t xml:space="preserve">’den türetildi; buradaki metin daha hafif — ana fikirler artı sözlü olarak söylemeye değer ayrıntılar. İngilizce slayt destesi ayrı bir dosyada:</w:t>
       </w:r>
       <w:r>
         <w:t xml:space="preserve"> </w:t>
@@ -93,7 +93,7 @@
         <w:t xml:space="preserve"> </w:t>
       </w:r>
       <w:r>
-        <w:t xml:space="preserve">Maddeler ≈ slaytta ne yer alacağı (gerçek slaytta kısa tutun; sözlü genişletin).</w:t>
+        <w:t xml:space="preserve">Maddeler ≈ slaytta yazacak olan şey (gerçek slaytta kısa tut; ayrıntıyı sözlü anlat).</w:t>
       </w:r>
       <w:r>
         <w:t xml:space="preserve"> </w:t>
@@ -108,22 +108,22 @@
         <w:t xml:space="preserve"> </w:t>
       </w:r>
       <w:r>
-        <w:t xml:space="preserve">= oraya hangi şemayı veya ekran görüntüsünü koyacağınızı ve neyi göstereceğinizi söyleyen bir yer tutucu. Bir backend destesi çoğunlukla</w:t>
-      </w:r>
-      <w:r>
-        <w:t xml:space="preserve"> </w:t>
-      </w:r>
-      <w:r>
-        <w:rPr>
-          <w:b/>
-        </w:rPr>
-        <w:t xml:space="preserve">şemalar</w:t>
-      </w:r>
-      <w:r>
-        <w:t xml:space="preserve"> </w:t>
-      </w:r>
-      <w:r>
-        <w:t xml:space="preserve">artı kurduğunuz gerçek kokpit ekranlarıdır (Pipeline hunisi, Faydalı Makaleler + YZ detayı). Burada gizli bir not izi yoktur — rakamlar ve teknik adlar bilerek slayt içeriğine yazılmıştır: normal slayt metni gibi okunur ve bir hoca takip sorusu sorduğunda kafanızda olmasını isteyeceğiniz şeylerdir.</w:t>
+        <w:t xml:space="preserve">= oraya hangi şemayı ya da ekran görüntüsünü koyacağını ve neyi işaret edeceğini söyleyen bir not. Bir backend destesi çoğunlukla</w:t>
+      </w:r>
+      <w:r>
+        <w:t xml:space="preserve"> </w:t>
+      </w:r>
+      <w:r>
+        <w:rPr>
+          <w:b/>
+        </w:rPr>
+        <w:t xml:space="preserve">şemalardan</w:t>
+      </w:r>
+      <w:r>
+        <w:t xml:space="preserve"> </w:t>
+      </w:r>
+      <w:r>
+        <w:t xml:space="preserve">ve senin kurduğun gerçek kokpit ekranlarından oluşur (Pipeline hunisi, Faydalı Makaleler + YZ detayı). Burada gizli bir not satırı yok — rakamlar ve teknik terimler bilerek slayt metnine yazıldı: hem normal slayt metni gibi okunuyorlar hem de bir hoca takip sorusu sorduğunda aklında olmasını isteyeceğin şeyler.</w:t>
       </w:r>
     </w:p>
     <w:p>
@@ -134,7 +134,7 @@
         <w:rPr>
           <w:b/>
         </w:rPr>
-        <w:t xml:space="preserve">Ekip bölümü (bir kez söyle, Slayt 2):</w:t>
+        <w:t xml:space="preserve">Ekip bölümü (bir kez söyle, 2. slayt):</w:t>
       </w:r>
       <w:r>
         <w:t xml:space="preserve"> </w:t>
@@ -149,7 +149,7 @@
         <w:t xml:space="preserve">fuzzyMatch</w:t>
       </w:r>
       <w:r>
-        <w:t xml:space="preserve">, öneriler, parola-sıfırlama düzeltmesi, tema merkezileştirmesi, sonsuz kaydırma).</w:t>
+        <w:t xml:space="preserve">, öneriler, parola sıfırlama düzeltmesi, tema merkezileştirmesi, sonsuz kaydırma).</w:t>
       </w:r>
     </w:p>
     <w:p>
@@ -183,22 +183,22 @@
         <w:rPr>
           <w:b/>
         </w:rPr>
-        <w:t xml:space="preserve">GÖRSEL — kahraman şema:</w:t>
-      </w:r>
-      <w:r>
-        <w:t xml:space="preserve"> </w:t>
-      </w:r>
-      <w:r>
-        <w:t xml:space="preserve">tüm hat tek bir soldan-sağa akış olarak —</w:t>
-      </w:r>
-      <w:r>
-        <w:t xml:space="preserve"> </w:t>
-      </w:r>
-      <w:r>
-        <w:rPr>
-          <w:b/>
-        </w:rPr>
-        <w:t xml:space="preserve">Tarayıcı → YZ kademesi → Normalleştirici + güven kapısı → Veritabanı → (düşük güven) İnsan kuyruğu / (yüksek güven) otomatik-kesinleştirilmiş.</w:t>
+        <w:t xml:space="preserve">GÖRSEL — kapak şeması:</w:t>
+      </w:r>
+      <w:r>
+        <w:t xml:space="preserve"> </w:t>
+      </w:r>
+      <w:r>
+        <w:t xml:space="preserve">tüm hat soldan sağa tek bir akış olarak —</w:t>
+      </w:r>
+      <w:r>
+        <w:t xml:space="preserve"> </w:t>
+      </w:r>
+      <w:r>
+        <w:rPr>
+          <w:b/>
+        </w:rPr>
+        <w:t xml:space="preserve">Tarayıcı → YZ kademesi → Normalleştirici + güven kapısı → Veritabanı → (düşük güven) İnsan kuyruğu / (yüksek güven) otomatik kesinleştirme.</w:t>
       </w:r>
       <w:r>
         <w:t xml:space="preserve"> </w:t>
@@ -240,7 +240,7 @@
         <w:t xml:space="preserve">“</w:t>
       </w:r>
       <w:r>
-        <w:t xml:space="preserve">Tüm literatürü güvenilir adaylardan oluşan temiz bir kuyruğa çeviren — ve kendi kendini çalıştıran — backend.</w:t>
+        <w:t xml:space="preserve">Tüm literatürü güvenilir adaylardan oluşan temiz bir kuyruğa çeviren — ve kendi kendine çalışan — backend.</w:t>
       </w:r>
       <w:r>
         <w:t xml:space="preserve">”</w:t>
@@ -291,7 +291,7 @@
         <w:rPr>
           <w:i/>
         </w:rPr>
-        <w:t xml:space="preserve">Makaleleri bulan, onları okuyan, neyin güvenilir olduğuna karar veren ve yalnızca geri kalanını bir insana saklayan sistemi kurdum — ücretsiz altyapıda, her beş dakikada bir kendi kendine çalışarak.</w:t>
+        <w:t xml:space="preserve">Makaleleri bulan, onları okuyan, neyin güvenilir olduğuna karar veren ve yalnızca geri kalanı bir insana bırakan sistemi kurdum — ücretsiz altyapıda, beş dakikada bir, kendi kendine.</w:t>
       </w:r>
       <w:r>
         <w:rPr>
@@ -311,9 +311,9 @@
       <w:pPr>
         <w:pStyle w:val="Heading2"/>
       </w:pPr>
-      <w:bookmarkStart w:id="22" w:name="X0352591f02e2645d216ba5873842e87135746d1"/>
-      <w:r>
-        <w:t xml:space="preserve">Slayt 1 — Problem: besin verisi hâlâ elle kuruluyor</w:t>
+      <w:bookmarkStart w:id="22" w:name="X52750cb10c1cb0f3115693eaf91c52639679fa2"/>
+      <w:r>
+        <w:t xml:space="preserve">Slayt 1 — Problem: besin verisi hâlâ elle üretiliyor</w:t>
       </w:r>
       <w:bookmarkEnd w:id="22"/>
     </w:p>
@@ -331,13 +331,13 @@
         <w:rPr>
           <w:b/>
         </w:rPr>
-        <w:t xml:space="preserve">GÖRSEL — bölünmüş illüstrasyon:</w:t>
-      </w:r>
-      <w:r>
-        <w:t xml:space="preserve"> </w:t>
-      </w:r>
-      <w:r>
-        <w:t xml:space="preserve">solda yoğun bir PDF tablosu; sağda seyrek bir veritabanı. Arada ok:</w:t>
+        <w:t xml:space="preserve">GÖRSEL — ikiye bölünmüş çizim:</w:t>
+      </w:r>
+      <w:r>
+        <w:t xml:space="preserve"> </w:t>
+      </w:r>
+      <w:r>
+        <w:t xml:space="preserve">solda sayılarla dolu yoğun bir PDF tablosu; sağda neredeyse boş bir veritabanı. Aralarında bir ok:</w:t>
       </w:r>
       <w:r>
         <w:t xml:space="preserve"> </w:t>
@@ -364,7 +364,7 @@
         <w:t xml:space="preserve">“</w:t>
       </w:r>
       <w:r>
-        <w:t xml:space="preserve">🐌 yavaş · 💸 pahalı · 📉 dar &amp; eski.</w:t>
+        <w:t xml:space="preserve">🐌 yavaş · 💸 pahalı · 📉 dar ve güncelliğini yitirmiş.</w:t>
       </w:r>
       <w:r>
         <w:t xml:space="preserve">”</w:t>
@@ -385,7 +385,7 @@
         <w:t xml:space="preserve">“</w:t>
       </w:r>
       <w:r>
-        <w:t xml:space="preserve">Veri var. Onu elle çıkarmak ölçeklenmiyor; denetimsiz bir YZ ile okumak güvenilir değil.</w:t>
+        <w:t xml:space="preserve">Veri var. Elle çıkarmak ölçeklenmiyor; denetimsiz bir YZ ile çıkarmak ise güvenilir değil.</w:t>
       </w:r>
       <w:r>
         <w:t xml:space="preserve">”</w:t>
@@ -427,7 +427,7 @@
         <w:pStyle w:val="Compact"/>
       </w:pPr>
       <w:r>
-        <w:t xml:space="preserve">Bugün</w:t>
+        <w:t xml:space="preserve">Bugün bu veri</w:t>
       </w:r>
       <w:r>
         <w:t xml:space="preserve"> </w:t>
@@ -442,7 +442,7 @@
         <w:t xml:space="preserve"> </w:t>
       </w:r>
       <w:r>
-        <w:t xml:space="preserve">kurulur: makaleyi oku, tabloyu bul, her sayıyı tek tek veritabanına yaz.</w:t>
+        <w:t xml:space="preserve">üretiliyor: makaleyi oku, tabloyu bul, her sayıyı tek tek veritabanına yaz.</w:t>
       </w:r>
     </w:p>
     <w:p>
@@ -478,7 +478,7 @@
         <w:rPr>
           <w:b/>
         </w:rPr>
-        <w:t xml:space="preserve">eskir</w:t>
+        <w:t xml:space="preserve">güncelliğini yitirir</w:t>
       </w:r>
       <w:r>
         <w:t xml:space="preserve">.</w:t>
@@ -493,7 +493,7 @@
         <w:pStyle w:val="Compact"/>
       </w:pPr>
       <w:r>
-        <w:t xml:space="preserve">Veri zaten var — sürekli yayımlanıyor — ama yapısız PDF’lerin içinde kilitli.</w:t>
+        <w:t xml:space="preserve">Veri zaten var — sürekli yayımlanıyor — ama yapısı belirsiz PDF’lerin içine gömülü.</w:t>
       </w:r>
     </w:p>
     <w:p>
@@ -505,19 +505,22 @@
         <w:pStyle w:val="Compact"/>
       </w:pPr>
       <w:r>
-        <w:t xml:space="preserve">Bir YZ’ye denetimsiz okutamazsınız: bir etikette güvenilemeyecek kadar</w:t>
-      </w:r>
-      <w:r>
-        <w:t xml:space="preserve"> </w:t>
-      </w:r>
-      <w:r>
-        <w:rPr>
-          <w:b/>
-        </w:rPr>
-        <w:t xml:space="preserve">çok yanlış sayı</w:t>
-      </w:r>
-      <w:r>
-        <w:t xml:space="preserve">.</w:t>
+        <w:t xml:space="preserve">Bir YZ’ye denetimsiz de okutamazsın: bir etikette güvenilemeyecek kadar</w:t>
+      </w:r>
+      <w:r>
+        <w:t xml:space="preserve"> </w:t>
+      </w:r>
+      <w:r>
+        <w:rPr>
+          <w:b/>
+        </w:rPr>
+        <w:t xml:space="preserve">çok hatalı sayı</w:t>
+      </w:r>
+      <w:r>
+        <w:t xml:space="preserve"> </w:t>
+      </w:r>
+      <w:r>
+        <w:t xml:space="preserve">çıkar.</w:t>
       </w:r>
     </w:p>
     <w:p>
@@ -563,7 +566,7 @@
         <w:t xml:space="preserve">[Backend hattı] → [Veritabanı] → [Etiketleyici frontend]</w:t>
       </w:r>
       <w:r>
-        <w:t xml:space="preserve">, YZ kutusu</w:t>
+        <w:t xml:space="preserve">; YZ kutusundan</w:t>
       </w:r>
       <w:r>
         <w:t xml:space="preserve"> </w:t>
@@ -599,7 +602,7 @@
         <w:t xml:space="preserve"> </w:t>
       </w:r>
       <w:r>
-        <w:t xml:space="preserve">dallarıyla. Backend + veritabanının</w:t>
+        <w:t xml:space="preserve">dalları çıkıyor. Backend + veritabanının</w:t>
       </w:r>
       <w:r>
         <w:t xml:space="preserve"> </w:t>
@@ -629,7 +632,7 @@
         <w:t xml:space="preserve">“</w:t>
       </w:r>
       <w:r>
-        <w:t xml:space="preserve">Yapay zekâ sayıları önerir. İnsan, emin olmadıklarını doğrular.</w:t>
+        <w:t xml:space="preserve">Yapay zekâ sayıları önerir. İnsan yalnızca emin olunmayanları doğrular.</w:t>
       </w:r>
       <w:r>
         <w:t xml:space="preserve">”</w:t>
@@ -653,7 +656,7 @@
         <w:rPr>
           <w:b/>
         </w:rPr>
-        <w:t xml:space="preserve">yapay zekâ makaleyi okuyup sayıları önerir; insan, yapay zekânın emin olmadıklarını doğrular</w:t>
+        <w:t xml:space="preserve">yapay zekâ makaleyi okuyup sayıları önerir; insan yalnızca yapay zekânın emin olmadıklarını doğrular</w:t>
       </w:r>
       <w:r>
         <w:t xml:space="preserve"> </w:t>
@@ -692,7 +695,7 @@
         <w:t xml:space="preserve"> </w:t>
       </w:r>
       <w:r>
-        <w:t xml:space="preserve">(ben) — makaleleri bulur, PDF’leri çeker, YZ kademesini çalıştırır →</w:t>
+        <w:t xml:space="preserve">(ben) — makaleleri bulur, PDF’leri indirir, YZ kademesini çalıştırır →</w:t>
       </w:r>
       <w:r>
         <w:t xml:space="preserve"> </w:t>
@@ -707,7 +710,25 @@
         <w:t xml:space="preserve"> </w:t>
       </w:r>
       <w:r>
-        <w:t xml:space="preserve">değerler ve güvenilir-mi-belirsiz-mi kararını verir.</w:t>
+        <w:t xml:space="preserve">değerler; ve</w:t>
+      </w:r>
+      <w:r>
+        <w:t xml:space="preserve"> </w:t>
+      </w:r>
+      <w:r>
+        <w:t xml:space="preserve">“</w:t>
+      </w:r>
+      <w:r>
+        <w:t xml:space="preserve">güvenilir mi, belirsiz mi</w:t>
+      </w:r>
+      <w:r>
+        <w:t xml:space="preserve">”</w:t>
+      </w:r>
+      <w:r>
+        <w:t xml:space="preserve"> </w:t>
+      </w:r>
+      <w:r>
+        <w:t xml:space="preserve">kararını verir.</w:t>
       </w:r>
     </w:p>
     <w:p>
@@ -764,7 +785,7 @@
         <w:rPr>
           <w:b/>
         </w:rPr>
-        <w:t xml:space="preserve">Benim parçam backend’in tamamı — insandan önce ve etrafında olan her şey. Bu sunumun geri kalanı bununla ilgili.</w:t>
+        <w:t xml:space="preserve">Benim parçam backend’in tamamı — insandan önce ve çevresinde olan her şey. Bu sunumun geri kalanı onunla ilgili.</w:t>
       </w:r>
     </w:p>
     <w:p>
@@ -828,7 +849,7 @@
         <w:rPr>
           <w:i/>
         </w:rPr>
-        <w:t xml:space="preserve">argümanıdır; arka arkaya üçüncü bir hat şeması yerine temiz metin olarak daha iyi oturur. İsteğe bağlı alt satır:</w:t>
+        <w:t xml:space="preserve">argümanı; arka arkaya üçüncü bir hat şeması yerine sade bir metin olarak daha iyi oturuyor. İstenirse alt satır:</w:t>
       </w:r>
       <w:r>
         <w:rPr>
@@ -846,7 +867,7 @@
         <w:rPr>
           <w:i/>
         </w:rPr>
-        <w:t xml:space="preserve">Frontend ancak kendisine ulaşan şey kadar iyi olabilir. Backend, ona ulaşan şeydir.</w:t>
+        <w:t xml:space="preserve">Frontend, ancak kendisine ulaşan veri kadar iyi olabilir. Backend, ona ulaşan veriyi hazırlayan şeydir.</w:t>
       </w:r>
       <w:r>
         <w:rPr>
@@ -885,7 +906,7 @@
         <w:t xml:space="preserve"> </w:t>
       </w:r>
       <w:r>
-        <w:t xml:space="preserve">— veritabanı, YZ hattı, tarayıcı, öğrenme döngüsü ve bunların hepsini gözetimsiz, ücretsiz altyapıda, her 5 dakikada bir çalıştıran otomasyon.</w:t>
+        <w:t xml:space="preserve">— veritabanı, YZ hattı, makale tarayıcısı, öğrenme döngüsü ve bunların hepsini gözetimsiz, ücretsiz altyapıda, beş dakikada bir çalıştıran otomasyon.</w:t>
       </w:r>
     </w:p>
     <w:p>
@@ -918,7 +939,7 @@
         <w:t xml:space="preserve">bulması</w:t>
       </w:r>
       <w:r>
-        <w:t xml:space="preserve">, PDF’leri düşman yayıncı sitelerinden</w:t>
+        <w:t xml:space="preserve">, PDF’leri zorlu yayıncı sitelerinden</w:t>
       </w:r>
       <w:r>
         <w:t xml:space="preserve"> </w:t>
@@ -927,10 +948,10 @@
         <w:rPr>
           <w:i/>
         </w:rPr>
-        <w:t xml:space="preserve">çekmesi</w:t>
-      </w:r>
-      <w:r>
-        <w:t xml:space="preserve">, ucuza</w:t>
+        <w:t xml:space="preserve">indirmesi</w:t>
+      </w:r>
+      <w:r>
+        <w:t xml:space="preserve">, onları ucuza</w:t>
       </w:r>
       <w:r>
         <w:t xml:space="preserve"> </w:t>
@@ -942,7 +963,19 @@
         <w:t xml:space="preserve">okuması</w:t>
       </w:r>
       <w:r>
-        <w:t xml:space="preserve">, güvenilir-mi-belirsiz-mi</w:t>
+        <w:t xml:space="preserve">,</w:t>
+      </w:r>
+      <w:r>
+        <w:t xml:space="preserve"> </w:t>
+      </w:r>
+      <w:r>
+        <w:t xml:space="preserve">“</w:t>
+      </w:r>
+      <w:r>
+        <w:t xml:space="preserve">güvenilir mi, belirsiz mi</w:t>
+      </w:r>
+      <w:r>
+        <w:t xml:space="preserve">”</w:t>
       </w:r>
       <w:r>
         <w:t xml:space="preserve"> </w:t>
@@ -978,13 +1011,13 @@
         <w:rPr>
           <w:i/>
         </w:rPr>
-        <w:t xml:space="preserve">makineyi çalışır tutması</w:t>
-      </w:r>
-      <w:r>
-        <w:t xml:space="preserve"> </w:t>
-      </w:r>
-      <w:r>
-        <w:t xml:space="preserve">gerekir.</w:t>
+        <w:t xml:space="preserve">sistemi ayakta tutması</w:t>
+      </w:r>
+      <w:r>
+        <w:t xml:space="preserve"> </w:t>
+      </w:r>
+      <w:r>
+        <w:t xml:space="preserve">gerekiyor.</w:t>
       </w:r>
     </w:p>
     <w:p>
@@ -996,7 +1029,7 @@
         <w:pStyle w:val="Compact"/>
       </w:pPr>
       <w:r>
-        <w:t xml:space="preserve">Projenin asıl riskini taşır: yanlış bir otomatik-kabul bir gıda veritabanını bozar; bozuk bir politika veri sızdırır; takılan bir işçi her şeyi durdurur.</w:t>
+        <w:t xml:space="preserve">Projenin asıl riskini taşıyan da bu: yanlış bir otomatik kabul bir gıda veritabanını bozar; hatalı bir politika veri sızdırır; takılı bir işçi her şeyi durdurur.</w:t>
       </w:r>
       <w:r>
         <w:t xml:space="preserve"> </w:t>
@@ -1023,7 +1056,13 @@
         <w:rPr>
           <w:b/>
         </w:rPr>
-        <w:t xml:space="preserve">in hepsi aynı anda doğru olmalı.</w:t>
+        <w:t xml:space="preserve"> </w:t>
+      </w:r>
+      <w:r>
+        <w:rPr>
+          <w:b/>
+        </w:rPr>
+        <w:t xml:space="preserve">üçünün de aynı anda sağlanması gerekiyor.</w:t>
       </w:r>
     </w:p>
     <w:p>
@@ -1051,7 +1090,7 @@
         <w:rPr>
           <w:i/>
         </w:rPr>
-        <w:t xml:space="preserve">(Görsel yok — ajanda slaytı; numaralı liste zaten görseldir. İsteğe bağlı alt satır:</w:t>
+        <w:t xml:space="preserve">(Görsel yok — bu ajanda slaytı; numaralı listenin kendisi zaten görsel. İstenirse alt satır:</w:t>
       </w:r>
       <w:r>
         <w:rPr>
@@ -1069,7 +1108,7 @@
         <w:rPr>
           <w:i/>
         </w:rPr>
-        <w:t xml:space="preserve">Supabase ve GitHub ücretsiz katmanlarında, kendi kendini çalıştıran bir araştırma hattı.</w:t>
+        <w:t xml:space="preserve">Hepsi Supabase ve GitHub’ın ücretsiz katmanlarında, kendi kendine çalışan bir araştırma hattı.</w:t>
       </w:r>
       <w:r>
         <w:rPr>
@@ -1096,7 +1135,7 @@
         <w:rPr>
           <w:b/>
         </w:rPr>
-        <w:t xml:space="preserve">Veritabanı &amp; güvenlik sözleşmesi</w:t>
+        <w:t xml:space="preserve">Veritabanı ve güvenlik sözleşmesi</w:t>
       </w:r>
       <w:r>
         <w:t xml:space="preserve"> </w:t>
@@ -1117,13 +1156,13 @@
         <w:rPr>
           <w:b/>
         </w:rPr>
-        <w:t xml:space="preserve">Makale-keşif tarayıcısı</w:t>
-      </w:r>
-      <w:r>
-        <w:t xml:space="preserve"> </w:t>
-      </w:r>
-      <w:r>
-        <w:t xml:space="preserve">— ön kapı: arama → filtre → edinim.</w:t>
+        <w:t xml:space="preserve">Makale tarayıcısı (crawler)</w:t>
+      </w:r>
+      <w:r>
+        <w:t xml:space="preserve"> </w:t>
+      </w:r>
+      <w:r>
+        <w:t xml:space="preserve">— sistemin ön kapısı: arama → filtre → indirme.</w:t>
       </w:r>
     </w:p>
     <w:p>
@@ -1138,13 +1177,13 @@
         <w:rPr>
           <w:b/>
         </w:rPr>
-        <w:t xml:space="preserve">Üç-aşamalı YZ kademesi</w:t>
-      </w:r>
-      <w:r>
-        <w:t xml:space="preserve"> </w:t>
-      </w:r>
-      <w:r>
-        <w:t xml:space="preserve">— Gemma → Flash-Lite → Flash, tek paylaşılan sözleşme.</w:t>
+        <w:t xml:space="preserve">Üç aşamalı YZ kademesi</w:t>
+      </w:r>
+      <w:r>
+        <w:t xml:space="preserve"> </w:t>
+      </w:r>
+      <w:r>
+        <w:t xml:space="preserve">— Gemma → Flash-Lite → Flash, tek bir ortak sözleşme.</w:t>
       </w:r>
     </w:p>
     <w:p>
@@ -1159,13 +1198,13 @@
         <w:rPr>
           <w:b/>
         </w:rPr>
-        <w:t xml:space="preserve">Deterministik normalleştirici &amp; güven kapısı</w:t>
-      </w:r>
-      <w:r>
-        <w:t xml:space="preserve"> </w:t>
-      </w:r>
-      <w:r>
-        <w:t xml:space="preserve">— tahmin → güvenilir veri, ya da bir insanın işi.</w:t>
+        <w:t xml:space="preserve">Deterministik normalleştirici ve güven kapısı</w:t>
+      </w:r>
+      <w:r>
+        <w:t xml:space="preserve"> </w:t>
+      </w:r>
+      <w:r>
+        <w:t xml:space="preserve">— tahmin → güvenilir veri ya da bir insanın işi.</w:t>
       </w:r>
     </w:p>
     <w:p>
@@ -1180,7 +1219,7 @@
         <w:rPr>
           <w:b/>
         </w:rPr>
-        <w:t xml:space="preserve">Geri besleme-öğrenme döngüsü</w:t>
+        <w:t xml:space="preserve">Geri besleme ile öğrenme döngüsü</w:t>
       </w:r>
       <w:r>
         <w:t xml:space="preserve"> </w:t>
@@ -1201,13 +1240,13 @@
         <w:rPr>
           <w:b/>
         </w:rPr>
-        <w:t xml:space="preserve">Günlük-operasyon otomasyonu</w:t>
-      </w:r>
-      <w:r>
-        <w:t xml:space="preserve"> </w:t>
-      </w:r>
-      <w:r>
-        <w:t xml:space="preserve">— 5 dk’lık cron’da bir denetleyici + 5 paralel işçi.</w:t>
+        <w:t xml:space="preserve">Günlük operasyon otomasyonu</w:t>
+      </w:r>
+      <w:r>
+        <w:t xml:space="preserve"> </w:t>
+      </w:r>
+      <w:r>
+        <w:t xml:space="preserve">— beş dakikalık cron’da bir controller + 5 paralel işçi.</w:t>
       </w:r>
     </w:p>
     <w:p>
@@ -1222,13 +1261,13 @@
         <w:rPr>
           <w:b/>
         </w:rPr>
-        <w:t xml:space="preserve">Referans veri, sağlamlaştırma, testler &amp; doküman</w:t>
-      </w:r>
-      <w:r>
-        <w:t xml:space="preserve"> </w:t>
-      </w:r>
-      <w:r>
-        <w:t xml:space="preserve">— bunu demo değil sistem yapan şey.</w:t>
+        <w:t xml:space="preserve">Referans verisi, optimizasyon, testler ve doküman</w:t>
+      </w:r>
+      <w:r>
+        <w:t xml:space="preserve"> </w:t>
+      </w:r>
+      <w:r>
+        <w:t xml:space="preserve">— bunu demo değil, sistem yapan şey.</w:t>
       </w:r>
     </w:p>
     <w:p>
@@ -1242,9 +1281,9 @@
       <w:pPr>
         <w:pStyle w:val="Heading2"/>
       </w:pPr>
-      <w:bookmarkStart w:id="26" w:name="slayt-5-1-veritabanı-güvenlik-sözleşmesi"/>
-      <w:r>
-        <w:t xml:space="preserve">Slayt 5 — 1) Veritabanı &amp; güvenlik sözleşmesi</w:t>
+      <w:bookmarkStart w:id="26" w:name="X3ac3e3e6793dc954c0e6a87edb22e84df7c4c03"/>
+      <w:r>
+        <w:t xml:space="preserve">Slayt 5 — 1) Veritabanı ve güvenlik sözleşmesi</w:t>
       </w:r>
       <w:bookmarkEnd w:id="26"/>
     </w:p>
@@ -1283,7 +1322,7 @@
         <w:t xml:space="preserve"> </w:t>
       </w:r>
       <w:r>
-        <w:t xml:space="preserve">— yan rozetle:</w:t>
+        <w:t xml:space="preserve">— yanında bir rozet:</w:t>
       </w:r>
       <w:r>
         <w:t xml:space="preserve"> </w:t>
@@ -1298,6 +1337,12 @@
         <w:t xml:space="preserve"> </w:t>
       </w:r>
       <w:r>
+        <w:t xml:space="preserve">Bir köşeye</w:t>
+      </w:r>
+      <w:r>
+        <w:t xml:space="preserve"> </w:t>
+      </w:r>
+      <w:r>
         <w:rPr>
           <w:rStyle w:val="VerbatimChar"/>
         </w:rPr>
@@ -1307,7 +1352,7 @@
         <w:t xml:space="preserve"> </w:t>
       </w:r>
       <w:r>
-        <w:t xml:space="preserve">tek-satırını ekle.</w:t>
+        <w:t xml:space="preserve">satırını koy.</w:t>
       </w:r>
       <w:r>
         <w:t xml:space="preserve"> </w:t>
@@ -1358,7 +1403,7 @@
         <w:t xml:space="preserve"> </w:t>
       </w:r>
       <w:r>
-        <w:t xml:space="preserve">— o olmadan hiçbir şey etiket gönderemez, makale kaydedemez, görev alamaz veya gerçeği gösteremez.</w:t>
+        <w:t xml:space="preserve">— o olmadan hiçbir şey etiket gönderemez, makale kaydedemez, görev alamaz ya da doğru veriyi gösteremez.</w:t>
       </w:r>
     </w:p>
     <w:p>
@@ -1373,13 +1418,13 @@
         <w:rPr>
           <w:b/>
         </w:rPr>
-        <w:t xml:space="preserve">Tek, yakınsayan, idempotent migrasyon</w:t>
-      </w:r>
-      <w:r>
-        <w:t xml:space="preserve"> </w:t>
-      </w:r>
-      <w:r>
-        <w:t xml:space="preserve">— canlı DB’de sonsuza dek yeniden çalıştırmaya güvenli (</w:t>
+        <w:t xml:space="preserve">Tek, idempotent bir migrasyon</w:t>
+      </w:r>
+      <w:r>
+        <w:t xml:space="preserve"> </w:t>
+      </w:r>
+      <w:r>
+        <w:t xml:space="preserve">— canlı veritabanına her zaman güvenle tekrar uygulanabilir (</w:t>
       </w:r>
       <w:r>
         <w:rPr>
@@ -1430,13 +1475,10 @@
         <w:rPr>
           <w:b/>
         </w:rPr>
-        <w:t xml:space="preserve">En-az-ayrıcalıklı güvenlik: 75 RLS politikası</w:t>
-      </w:r>
-      <w:r>
-        <w:t xml:space="preserve"> </w:t>
-      </w:r>
-      <w:r>
-        <w:t xml:space="preserve">6</w:t>
+        <w:t xml:space="preserve">En az yetki ilkesine dayalı güvenlik: 75 RLS politikası</w:t>
+      </w:r>
+      <w:r>
+        <w:t xml:space="preserve">, 6</w:t>
       </w:r>
       <w:r>
         <w:t xml:space="preserve"> </w:t>
@@ -1451,7 +1493,7 @@
         <w:t xml:space="preserve"> </w:t>
       </w:r>
       <w:r>
-        <w:t xml:space="preserve">yüklem üzerine — salt-okunur eğitim erişimi</w:t>
+        <w:t xml:space="preserve">yüklemi üzerine — salt okunur eğitim erişimi</w:t>
       </w:r>
       <w:r>
         <w:t xml:space="preserve"> </w:t>
@@ -1466,7 +1508,7 @@
         <w:t xml:space="preserve"> </w:t>
       </w:r>
       <w:r>
-        <w:t xml:space="preserve">düşer,</w:t>
+        <w:t xml:space="preserve">geliyor:</w:t>
       </w:r>
       <w:r>
         <w:t xml:space="preserve"> </w:t>
@@ -1493,13 +1535,13 @@
         <w:rPr>
           <w:b/>
         </w:rPr>
-        <w:t xml:space="preserve">Ekibi kilitleyemezsiniz:</w:t>
-      </w:r>
-      <w:r>
-        <w:t xml:space="preserve"> </w:t>
-      </w:r>
-      <w:r>
-        <w:t xml:space="preserve">admin RPC’si sıfır etkin kokpit-yazma inceleyicisi bırakmayı reddeder; kayıt allowlist’i, tarayıcının ne okuyabildiği ne aşabildiği bir auth hook’uyla uygulanır.</w:t>
+        <w:t xml:space="preserve">Ekibi yanlışlıkla kilitleyemezsin:</w:t>
+      </w:r>
+      <w:r>
+        <w:t xml:space="preserve"> </w:t>
+      </w:r>
+      <w:r>
+        <w:t xml:space="preserve">admin RPC’si geriye hiç yazma yetkili kokpit inceleyicisi kalmayacaksa işlemi reddeder; kayıt izin listesi, tarayıcının ne okuyabildiği ne de aşabildiği bir auth hook’uyla uygulanır.</w:t>
       </w:r>
     </w:p>
     <w:p>
@@ -1513,9 +1555,9 @@
       <w:pPr>
         <w:pStyle w:val="Heading2"/>
       </w:pPr>
-      <w:bookmarkStart w:id="27" w:name="X0be77b326026c3b8ea66a29a732680d489006b1"/>
-      <w:r>
-        <w:t xml:space="preserve">Slayt 6 — 1) Sözleşme: atomik alım + hash-aynı gerçek</w:t>
+      <w:bookmarkStart w:id="27" w:name="X5c674fcdb2d9496675ed398703c831bdf91f289"/>
+      <w:r>
+        <w:t xml:space="preserve">Slayt 6 — 1) Sözleşme: atomik görev alma + aynı hash’i üreten doğru</w:t>
       </w:r>
       <w:bookmarkEnd w:id="27"/>
     </w:p>
@@ -1539,7 +1581,7 @@
         <w:t xml:space="preserve"> </w:t>
       </w:r>
       <w:r>
-        <w:t xml:space="preserve">(sol)</w:t>
+        <w:t xml:space="preserve">(solda)</w:t>
       </w:r>
       <w:r>
         <w:t xml:space="preserve"> </w:t>
@@ -1554,7 +1596,7 @@
         <w:t xml:space="preserve"> </w:t>
       </w:r>
       <w:r>
-        <w:t xml:space="preserve">SQL’i</w:t>
+        <w:t xml:space="preserve">SQL’i,</w:t>
       </w:r>
       <w:r>
         <w:t xml:space="preserve"> </w:t>
@@ -1570,7 +1612,7 @@
         <w:t xml:space="preserve"> </w:t>
       </w:r>
       <w:r>
-        <w:t xml:space="preserve">vurgulu, beş işçi oku her biri ayrık bir görev kümesi alıyor; (sağ)</w:t>
+        <w:t xml:space="preserve">vurgulu; beş işçi okunun her biri bağımsız bir görev kümesi alıyor. (sağda)</w:t>
       </w:r>
       <w:r>
         <w:t xml:space="preserve"> </w:t>
@@ -1615,19 +1657,25 @@
         <w:t xml:space="preserve">”</w:t>
       </w:r>
       <w:r>
-        <w:t xml:space="preserve">e akıyor ve</w:t>
-      </w:r>
-      <w:r>
-        <w:t xml:space="preserve"> </w:t>
-      </w:r>
-      <w:r>
-        <w:rPr>
-          <w:b/>
-        </w:rPr>
-        <w:t xml:space="preserve">aynı hash</w:t>
-      </w:r>
-      <w:r>
-        <w:t xml:space="preserve">’i üretiyor.</w:t>
+        <w:t xml:space="preserve"> </w:t>
+      </w:r>
+      <w:r>
+        <w:t xml:space="preserve">akışından geçip</w:t>
+      </w:r>
+      <w:r>
+        <w:t xml:space="preserve"> </w:t>
+      </w:r>
+      <w:r>
+        <w:rPr>
+          <w:b/>
+        </w:rPr>
+        <w:t xml:space="preserve">aynı hash’i</w:t>
+      </w:r>
+      <w:r>
+        <w:t xml:space="preserve"> </w:t>
+      </w:r>
+      <w:r>
+        <w:t xml:space="preserve">üretiyor.</w:t>
       </w:r>
       <w:r>
         <w:t xml:space="preserve"> </w:t>
@@ -1645,7 +1693,7 @@
         <w:t xml:space="preserve">“</w:t>
       </w:r>
       <w:r>
-        <w:t xml:space="preserve">Tek tümce 5 paralel işçiyi güvenli yapar. Tek disiplin YZ çıktısını insanınkiyle kıyaslanabilir yapar.</w:t>
+        <w:t xml:space="preserve">Tek bir ifade 5 paralel işçiyi güvenli kılıyor. Tek bir disiplin YZ çıktısını insanınkiyle karşılaştırılabilir yapıyor.</w:t>
       </w:r>
       <w:r>
         <w:t xml:space="preserve">”</w:t>
@@ -1667,10 +1715,7 @@
         <w:t xml:space="preserve">claim_paper_stage_tasks</w:t>
       </w:r>
       <w:r>
-        <w:t xml:space="preserve"> </w:t>
-      </w:r>
-      <w:r>
-        <w:t xml:space="preserve">kuyruktaki görevleri</w:t>
+        <w:t xml:space="preserve">, kuyruktaki görevleri</w:t>
       </w:r>
       <w:r>
         <w:t xml:space="preserve"> </w:t>
@@ -1685,7 +1730,7 @@
         <w:t xml:space="preserve"> </w:t>
       </w:r>
       <w:r>
-        <w:t xml:space="preserve">ile alır — o tek tümce,</w:t>
+        <w:t xml:space="preserve">ile alır — bu tek ifade,</w:t>
       </w:r>
       <w:r>
         <w:t xml:space="preserve"> </w:t>
@@ -1700,7 +1745,7 @@
         <w:t xml:space="preserve"> </w:t>
       </w:r>
       <w:r>
-        <w:t xml:space="preserve">sıfır koordinasyon, sıfır çift-işleme ile ayrık görevler almasını sağlar.</w:t>
+        <w:t xml:space="preserve">hiç koordinasyona gerek kalmadan, aynı görevi iki kez işlemeden bağımsız görevler almasını sağlar.</w:t>
       </w:r>
     </w:p>
     <w:p>
@@ -1715,13 +1760,13 @@
         <w:rPr>
           <w:b/>
         </w:rPr>
-        <w:t xml:space="preserve">Deterministik yük inşacıları:</w:t>
-      </w:r>
-      <w:r>
-        <w:t xml:space="preserve"> </w:t>
-      </w:r>
-      <w:r>
-        <w:t xml:space="preserve">bir SQL inşacısı bir insan gönderisini Python normalleştiricisiyle</w:t>
+        <w:t xml:space="preserve">Deterministik payload üreticileri:</w:t>
+      </w:r>
+      <w:r>
+        <w:t xml:space="preserve"> </w:t>
+      </w:r>
+      <w:r>
+        <w:t xml:space="preserve">bir SQL üreticisi, insan gönderisini Python normalleştiricisiyle</w:t>
       </w:r>
       <w:r>
         <w:t xml:space="preserve"> </w:t>
@@ -1751,16 +1796,16 @@
         <w:t xml:space="preserve"> </w:t>
       </w:r>
       <w:r>
-        <w:t xml:space="preserve">kurallarıyla kurar; böylece bir insan gönderisi ile aynı verinin YZ çıkarımı</w:t>
-      </w:r>
-      <w:r>
-        <w:t xml:space="preserve"> </w:t>
-      </w:r>
-      <w:r>
-        <w:rPr>
-          <w:b/>
-        </w:rPr>
-        <w:t xml:space="preserve">birebir aynı hash’lenir</w:t>
+        <w:t xml:space="preserve">kurallarıyla oluşturur; böylece aynı veriye ait bir insan gönderisi ile bir YZ çıkarımı</w:t>
+      </w:r>
+      <w:r>
+        <w:t xml:space="preserve"> </w:t>
+      </w:r>
+      <w:r>
+        <w:rPr>
+          <w:b/>
+        </w:rPr>
+        <w:t xml:space="preserve">aynı hash’i üretir</w:t>
       </w:r>
       <w:r>
         <w:t xml:space="preserve">.</w:t>
@@ -1785,7 +1830,7 @@
         <w:t xml:space="preserve"> </w:t>
       </w:r>
       <w:r>
-        <w:t xml:space="preserve">— SQL’de tam yapısal fark (eklenen/eksik satırlar için anti-join) → etiketleyici-performans metriklerinin ham maddesi.</w:t>
+        <w:t xml:space="preserve">— SQL içinde tam bir yapısal fark (eklenen/eksik satırlar için anti-join) → etiketleyici performans metriklerinin ham malzemesi.</w:t>
       </w:r>
     </w:p>
     <w:p>
@@ -1799,9 +1844,9 @@
       <w:pPr>
         <w:pStyle w:val="Heading2"/>
       </w:pPr>
-      <w:bookmarkStart w:id="28" w:name="X949b66d44360d487104e6a707011369d3ec278c"/>
-      <w:r>
-        <w:t xml:space="preserve">Slayt 7 — 2) Makale-keşif tarayıcısı (ön kapı)</w:t>
+      <w:bookmarkStart w:id="28" w:name="slayt-7-2-makale-tarayıcısı-ön-kapı"/>
+      <w:r>
+        <w:t xml:space="preserve">Slayt 7 — 2) Makale tarayıcısı (ön kapı)</w:t>
       </w:r>
       <w:bookmarkEnd w:id="28"/>
     </w:p>
@@ -1828,7 +1873,7 @@
         <w:rPr>
           <w:b/>
         </w:rPr>
-        <w:t xml:space="preserve">Arama (Europe PMC / OpenAlex / Semantic Scholar / DergiPark) → Filtre (toplamsal, sert veto yok, başlık+özet üzerinde) → Edinim (indir → katı tam-metin kapısı).</w:t>
+        <w:t xml:space="preserve">Arama (Europe PMC / OpenAlex / Semantic Scholar / DergiPark) → Filtre (eklemeli, kesin veto yok, başlık+özet üzerinde) → İndirme (indir → katı tam metin kapısı).</w:t>
       </w:r>
       <w:r>
         <w:t xml:space="preserve"> </w:t>
@@ -1837,7 +1882,7 @@
         <w:t xml:space="preserve">“</w:t>
       </w:r>
       <w:r>
-        <w:t xml:space="preserve">Önce ucuz metadata, sonra pahalı PDF</w:t>
+        <w:t xml:space="preserve">Önce ucuz üst veri, sonra pahalı PDF</w:t>
       </w:r>
       <w:r>
         <w:t xml:space="preserve">”</w:t>
@@ -1846,7 +1891,7 @@
         <w:t xml:space="preserve"> </w:t>
       </w:r>
       <w:r>
-        <w:t xml:space="preserve">işaretle. Filtre aşamasına kırmızı</w:t>
+        <w:t xml:space="preserve">diye işaretle. Filtre aşamasına kırmızı bir</w:t>
       </w:r>
       <w:r>
         <w:t xml:space="preserve"> </w:t>
@@ -1855,7 +1900,7 @@
         <w:t xml:space="preserve">“</w:t>
       </w:r>
       <w:r>
-        <w:t xml:space="preserve">sert-negatif veto yok</w:t>
+        <w:t xml:space="preserve">kesin olumsuz veto yok</w:t>
       </w:r>
       <w:r>
         <w:t xml:space="preserve">”</w:t>
@@ -1882,7 +1927,7 @@
         <w:t xml:space="preserve">“</w:t>
       </w:r>
       <w:r>
-        <w:t xml:space="preserve">Ürünün alan tanımını puanlamaya kodla — gerçek bir makaleyi tek bir başıboş kelime için öldürmeden.</w:t>
+        <w:t xml:space="preserve">Ürünün alan tanımını puanlamaya göm — ama gerçek bir makaleyi tek bir alakasız kelime için eleme.</w:t>
       </w:r>
       <w:r>
         <w:t xml:space="preserve">”</w:t>
@@ -1897,7 +1942,7 @@
         <w:pStyle w:val="Compact"/>
       </w:pPr>
       <w:r>
-        <w:t xml:space="preserve">Tarayıcı yanlış makaleleri kabul ederse</w:t>
+        <w:t xml:space="preserve">Tarayıcı yanlış makaleleri alırsa</w:t>
       </w:r>
       <w:r>
         <w:t xml:space="preserve"> </w:t>
@@ -1909,7 +1954,7 @@
         <w:t xml:space="preserve">model kotası ve etiketleyici zamanı boşa gider</w:t>
       </w:r>
       <w:r>
-        <w:t xml:space="preserve">; çok katıysa gerçek tabloları hiç bulamaz.</w:t>
+        <w:t xml:space="preserve">; fazla katı olursa gerçek tabloları hiç bulamaz.</w:t>
       </w:r>
     </w:p>
     <w:p>
@@ -1924,13 +1969,13 @@
         <w:rPr>
           <w:b/>
         </w:rPr>
-        <w:t xml:space="preserve">Arama → Filtre → Edinim</w:t>
-      </w:r>
-      <w:r>
-        <w:t xml:space="preserve"> </w:t>
-      </w:r>
-      <w:r>
-        <w:t xml:space="preserve">— önce ucuz metadata’da filtrele; PDF’i (yavaş, hataya açık) yalnızca geçenler için indir.</w:t>
+        <w:t xml:space="preserve">Arama → Filtre → İndirme</w:t>
+      </w:r>
+      <w:r>
+        <w:t xml:space="preserve"> </w:t>
+      </w:r>
+      <w:r>
+        <w:t xml:space="preserve">— önce ucuz üst veride filtrele; PDF’i (yavaş, hataya açık) yalnızca geçenler için indir.</w:t>
       </w:r>
     </w:p>
     <w:p>
@@ -1945,13 +1990,13 @@
         <w:rPr>
           <w:b/>
         </w:rPr>
-        <w:t xml:space="preserve">Tamamen toplamsal puanlama, asla sert veto:</w:t>
-      </w:r>
-      <w:r>
-        <w:t xml:space="preserve"> </w:t>
-      </w:r>
-      <w:r>
-        <w:t xml:space="preserve">bir negatif ifade (</w:t>
+        <w:t xml:space="preserve">Tamamen eklemeli puanlama, kesin veto yok:</w:t>
+      </w:r>
+      <w:r>
+        <w:t xml:space="preserve"> </w:t>
+      </w:r>
+      <w:r>
+        <w:t xml:space="preserve">olumsuz bir ifade (</w:t>
       </w:r>
       <w:r>
         <w:t xml:space="preserve">“</w:t>
@@ -1963,7 +2008,7 @@
         <w:t xml:space="preserve">”</w:t>
       </w:r>
       <w:r>
-        <w:t xml:space="preserve">) bir</w:t>
+        <w:t xml:space="preserve">) puanı</w:t>
       </w:r>
       <w:r>
         <w:t xml:space="preserve"> </w:t>
@@ -1972,10 +2017,10 @@
         <w:rPr>
           <w:i/>
         </w:rPr>
-        <w:t xml:space="preserve">cezadır</w:t>
-      </w:r>
-      <w:r>
-        <w:t xml:space="preserve">, otomatik-ret değil — tek bir kelime, bir bileşim tablosu da olan bir makaleyi öldüremez.</w:t>
+        <w:t xml:space="preserve">düşürür</w:t>
+      </w:r>
+      <w:r>
+        <w:t xml:space="preserve">, doğrudan elemez — tek bir kelime, içinde bir bileşim tablosu da olan bir makaleyi öldüremez.</w:t>
       </w:r>
     </w:p>
     <w:p>
@@ -1990,13 +2035,13 @@
         <w:rPr>
           <w:b/>
         </w:rPr>
-        <w:t xml:space="preserve">İçeri gevşek, dışarı katı:</w:t>
-      </w:r>
-      <w:r>
-        <w:t xml:space="preserve"> </w:t>
-      </w:r>
-      <w:r>
-        <w:t xml:space="preserve">metadata kapısı geri-çağırımı en üst düzeye çıkarır; tam-metin kapısı katıdır — yöntem kanıtı (AOAC/HPLC/GC/ICP),</w:t>
+        <w:t xml:space="preserve">Girişte gevşek, çıkışta katı:</w:t>
+      </w:r>
+      <w:r>
+        <w:t xml:space="preserve"> </w:t>
+      </w:r>
+      <w:r>
+        <w:t xml:space="preserve">üst veri kapısı recall’i en üst düzeye çıkarır; tam metin kapısı katıdır — yöntem kanıtı (AOAC/HPLC/GC/ICP),</w:t>
       </w:r>
       <w:r>
         <w:t xml:space="preserve"> </w:t>
@@ -2011,7 +2056,7 @@
         <w:t xml:space="preserve"> </w:t>
       </w:r>
       <w:r>
-        <w:t xml:space="preserve">birimleri, tablo sinyali, gıda sinyali ve proksimat panelle ≥4 örtüşme gerektirir.</w:t>
+        <w:t xml:space="preserve">birimleri, bir tablo sinyali, bir gıda sinyali ve temel besin paneliyle en az 4 örtüşme ister.</w:t>
       </w:r>
     </w:p>
     <w:p>
@@ -2023,7 +2068,7 @@
         <w:pStyle w:val="Compact"/>
       </w:pPr>
       <w:r>
-        <w:t xml:space="preserve">Kelime eşleşmesi Unicode kelime-sınırı duyarlı — Türkçe</w:t>
+        <w:t xml:space="preserve">Kelime eşleştirmesi Unicode kelime sınırlarına duyarlı — Türkçedeki</w:t>
       </w:r>
       <w:r>
         <w:t xml:space="preserve"> </w:t>
@@ -2056,7 +2101,7 @@
         <w:t xml:space="preserve"> </w:t>
       </w:r>
       <w:r>
-        <w:t xml:space="preserve">içinde değil, bir kelime olarak eşleşir.</w:t>
+        <w:t xml:space="preserve">içinde değil, gerçek bir kelime olarak eşleşir.</w:t>
       </w:r>
     </w:p>
     <w:p>
@@ -2070,9 +2115,9 @@
       <w:pPr>
         <w:pStyle w:val="Heading2"/>
       </w:pPr>
-      <w:bookmarkStart w:id="29" w:name="X3db9205f737c755d5e2832d7457f902ace3475d"/>
-      <w:r>
-        <w:t xml:space="preserve">Slayt 8 — 2) PDF edinimi: yayıncı bot-duvarlarını yenmek</w:t>
+      <w:bookmarkStart w:id="29" w:name="X91af37e2d424b3e3bd18e72d56188b61383da64"/>
+      <w:r>
+        <w:t xml:space="preserve">Slayt 8 — 2) PDF indirme: yayıncı bot duvarlarını aşmak</w:t>
       </w:r>
       <w:bookmarkEnd w:id="29"/>
     </w:p>
@@ -2090,22 +2135,22 @@
         <w:rPr>
           <w:b/>
         </w:rPr>
-        <w:t xml:space="preserve">GÖRSEL — yedek merdiveni:</w:t>
-      </w:r>
-      <w:r>
-        <w:t xml:space="preserve"> </w:t>
-      </w:r>
-      <w:r>
-        <w:t xml:space="preserve">aşağı doğru numaralı adımlar —</w:t>
-      </w:r>
-      <w:r>
-        <w:t xml:space="preserve"> </w:t>
-      </w:r>
-      <w:r>
-        <w:rPr>
-          <w:b/>
-        </w:rPr>
-        <w:t xml:space="preserve">1. PMC OA paketi (.tar.gz’den en büyük .pdf’i çıkar) → 2. doğrudan çekim (</w:t>
+        <w:t xml:space="preserve">GÖRSEL — yedek zinciri:</w:t>
+      </w:r>
+      <w:r>
+        <w:t xml:space="preserve"> </w:t>
+      </w:r>
+      <w:r>
+        <w:t xml:space="preserve">aşağı doğru inen numaralı adımlar —</w:t>
+      </w:r>
+      <w:r>
+        <w:t xml:space="preserve"> </w:t>
+      </w:r>
+      <w:r>
+        <w:rPr>
+          <w:b/>
+        </w:rPr>
+        <w:t xml:space="preserve">1. PMC OA paketi (.tar.gz içinden en büyük .pdf’i çıkar) → 2. doğrudan indirme (</w:t>
       </w:r>
       <w:r>
         <w:rPr>
@@ -2124,7 +2169,7 @@
         <w:rPr>
           <w:b/>
         </w:rPr>
-        <w:t xml:space="preserve">doğrula) → 3. tarayıcı User-Agent’lı curl → 4. PMC proof-of-work çöz → 5. HTML .pdf linkini kazı.</w:t>
+        <w:t xml:space="preserve">doğrula) → 3. tarayıcı User-Agent’lı curl → 4. PMC proof-of-work çöz → 5. HTML içindeki .pdf bağlantısını ayıkla.</w:t>
       </w:r>
       <w:r>
         <w:t xml:space="preserve"> </w:t>
@@ -2166,7 +2211,7 @@
         <w:t xml:space="preserve">“</w:t>
       </w:r>
       <w:r>
-        <w:t xml:space="preserve">Bir bot-duvarı, gerçek bir MD5 proof-of-work çözücüyle yenildi.</w:t>
+        <w:t xml:space="preserve">Bir bot duvarı, gerçek bir MD5 proof-of-work çözücüyle aşıldı.</w:t>
       </w:r>
       <w:r>
         <w:t xml:space="preserve">”</w:t>
@@ -2181,22 +2226,22 @@
         <w:pStyle w:val="Compact"/>
       </w:pPr>
       <w:r>
-        <w:t xml:space="preserve">Yayıncı PDF’leri direnir — bu yüzden edinim,</w:t>
-      </w:r>
-      <w:r>
-        <w:t xml:space="preserve"> </w:t>
-      </w:r>
-      <w:r>
-        <w:rPr>
-          <w:b/>
-        </w:rPr>
-        <w:t xml:space="preserve">katmanlı bir yedek merdivenidir</w:t>
-      </w:r>
-      <w:r>
-        <w:t xml:space="preserve"> </w:t>
-      </w:r>
-      <w:r>
-        <w:t xml:space="preserve">(5 adım), her biri öncekinin alamadığını yakalar.</w:t>
+        <w:t xml:space="preserve">Yayıncı PDF’leri kolay vermiyor — bu yüzden indirme,</w:t>
+      </w:r>
+      <w:r>
+        <w:t xml:space="preserve"> </w:t>
+      </w:r>
+      <w:r>
+        <w:rPr>
+          <w:b/>
+        </w:rPr>
+        <w:t xml:space="preserve">katmanlı bir yedek zinciri</w:t>
+      </w:r>
+      <w:r>
+        <w:t xml:space="preserve"> </w:t>
+      </w:r>
+      <w:r>
+        <w:t xml:space="preserve">(5 adım); her biri öncekinin alamadığını yakalıyor.</w:t>
       </w:r>
     </w:p>
     <w:p>
@@ -2211,13 +2256,13 @@
         <w:rPr>
           <w:b/>
         </w:rPr>
-        <w:t xml:space="preserve">Zor olan:</w:t>
-      </w:r>
-      <w:r>
-        <w:t xml:space="preserve"> </w:t>
-      </w:r>
-      <w:r>
-        <w:t xml:space="preserve">bir yayıncı HTML bot-duvarı döndürdüğünde,</w:t>
+        <w:t xml:space="preserve">Zor olan adım:</w:t>
+      </w:r>
+      <w:r>
+        <w:t xml:space="preserve"> </w:t>
+      </w:r>
+      <w:r>
+        <w:t xml:space="preserve">yayıncı bir HTML bot duvarı döndürdüğünde,</w:t>
       </w:r>
       <w:r>
         <w:t xml:space="preserve"> </w:t>
@@ -2232,16 +2277,16 @@
         <w:t xml:space="preserve"> </w:t>
       </w:r>
       <w:r>
-        <w:t xml:space="preserve">meydan okumayı ayrıştırır ve</w:t>
-      </w:r>
-      <w:r>
-        <w:t xml:space="preserve"> </w:t>
-      </w:r>
-      <w:r>
-        <w:rPr>
-          <w:b/>
-        </w:rPr>
-        <w:t xml:space="preserve">bir hashcash nonce’unu brute-force eder</w:t>
+        <w:t xml:space="preserve">meydan okumayı ayrıştırıp bir</w:t>
+      </w:r>
+      <w:r>
+        <w:t xml:space="preserve"> </w:t>
+      </w:r>
+      <w:r>
+        <w:rPr>
+          <w:b/>
+        </w:rPr>
+        <w:t xml:space="preserve">hashcash nonce’unu kaba kuvvetle çözer</w:t>
       </w:r>
       <w:r>
         <w:t xml:space="preserve"> </w:t>
@@ -2262,7 +2307,7 @@
         <w:t xml:space="preserve"> </w:t>
       </w:r>
       <w:r>
-        <w:t xml:space="preserve">N sıfırla başlayana dek artırır — sonra çözüm çereziyle tekrar dener.</w:t>
+        <w:t xml:space="preserve">belirli sayıda sıfırla başlayana kadar artırır — sonra çözüm çereziyle yeniden dener.</w:t>
       </w:r>
     </w:p>
     <w:p>
@@ -2283,7 +2328,7 @@
         <w:t xml:space="preserve"> </w:t>
       </w:r>
       <w:r>
-        <w:t xml:space="preserve">her canlı</w:t>
+        <w:t xml:space="preserve">canlıdaki tüm</w:t>
       </w:r>
       <w:r>
         <w:t xml:space="preserve"> </w:t>
@@ -2298,7 +2343,7 @@
         <w:t xml:space="preserve"> </w:t>
       </w:r>
       <w:r>
-        <w:t xml:space="preserve">+ yerel terminal durumlardan (metadata retleri dâhil) bir atlama-kümesi.</w:t>
+        <w:t xml:space="preserve">değerleri + yerel kalıcı durumlardan (üst veride elenenler dâhil) oluşan bir atlama listesi.</w:t>
       </w:r>
     </w:p>
     <w:p>
@@ -2313,13 +2358,13 @@
         <w:rPr>
           <w:b/>
         </w:rPr>
-        <w:t xml:space="preserve">Duvar-saati sınırlı (2.400 sn):</w:t>
-      </w:r>
-      <w:r>
-        <w:t xml:space="preserve"> </w:t>
-      </w:r>
-      <w:r>
-        <w:t xml:space="preserve">zaman aşımında temiz durur ve yine de her kabul edilen makaleyi + bir huni manifestini yazar — bir GitHub zaman aşımı asla iş kaybetmez.</w:t>
+        <w:t xml:space="preserve">Süre sınırlı (2.400 sn):</w:t>
+      </w:r>
+      <w:r>
+        <w:t xml:space="preserve"> </w:t>
+      </w:r>
+      <w:r>
+        <w:t xml:space="preserve">süre dolunca temiz biçimde durur, ama kabul edilen her makaleyi + bir huni raporunu yine de yazar — bir GitHub zaman aşımı asla iş kaybettirmez.</w:t>
       </w:r>
     </w:p>
     <w:p>
@@ -2335,7 +2380,7 @@
       </w:pPr>
       <w:bookmarkStart w:id="30" w:name="slayt-9-3-üç-aşamalı-yz-kademesi"/>
       <w:r>
-        <w:t xml:space="preserve">Slayt 9 — 3) Üç-aşamalı YZ kademesi</w:t>
+        <w:t xml:space="preserve">Slayt 9 — 3) Üç aşamalı YZ kademesi</w:t>
       </w:r>
       <w:bookmarkEnd w:id="30"/>
     </w:p>
@@ -2359,7 +2404,7 @@
         <w:t xml:space="preserve"> </w:t>
       </w:r>
       <w:r>
-        <w:t xml:space="preserve">üç küçülen çubuk —</w:t>
+        <w:t xml:space="preserve">küçülen üç çubuk —</w:t>
       </w:r>
       <w:r>
         <w:t xml:space="preserve"> </w:t>
@@ -2383,7 +2428,7 @@
         <w:t xml:space="preserve">“</w:t>
       </w:r>
       <w:r>
-        <w:t xml:space="preserve">öncelik puanı en iyi-N’yi seçer</w:t>
+        <w:t xml:space="preserve">öncelik puanı en iyi N’yi seçer</w:t>
       </w:r>
       <w:r>
         <w:t xml:space="preserve">”</w:t>
@@ -2392,7 +2437,7 @@
         <w:t xml:space="preserve"> </w:t>
       </w:r>
       <w:r>
-        <w:t xml:space="preserve">oku.</w:t>
+        <w:t xml:space="preserve">oku koy.</w:t>
       </w:r>
       <w:r>
         <w:t xml:space="preserve"> </w:t>
@@ -2410,7 +2455,7 @@
         <w:t xml:space="preserve">“</w:t>
       </w:r>
       <w:r>
-        <w:t xml:space="preserve">Günde ~20 pahalı çıkarımı, elenmiş ~1.500’ün en iyisine harca — ilk gelene değil.</w:t>
+        <w:t xml:space="preserve">Günde ~20 pahalı çıkarımı, elenmiş ~1.500 makalenin en iyisine harca — ilk gelene değil.</w:t>
       </w:r>
       <w:r>
         <w:t xml:space="preserve">”</w:t>
@@ -2425,22 +2470,22 @@
         <w:pStyle w:val="Compact"/>
       </w:pPr>
       <w:r>
-        <w:t xml:space="preserve">Nihai Gemini çıkarımı</w:t>
-      </w:r>
-      <w:r>
-        <w:t xml:space="preserve"> </w:t>
-      </w:r>
-      <w:r>
-        <w:rPr>
-          <w:b/>
-        </w:rPr>
-        <w:t xml:space="preserve">kıttır (ücretsiz kotada ~20/gün)</w:t>
-      </w:r>
-      <w:r>
-        <w:t xml:space="preserve"> </w:t>
-      </w:r>
-      <w:r>
-        <w:t xml:space="preserve">— her şeyi onunla elemek bütçeyi işe yaramaz makalelere harcardı.</w:t>
+        <w:t xml:space="preserve">Son Gemini çıkarımı</w:t>
+      </w:r>
+      <w:r>
+        <w:t xml:space="preserve"> </w:t>
+      </w:r>
+      <w:r>
+        <w:rPr>
+          <w:b/>
+        </w:rPr>
+        <w:t xml:space="preserve">kıt (ücretsiz kotada ~20/gün)</w:t>
+      </w:r>
+      <w:r>
+        <w:t xml:space="preserve"> </w:t>
+      </w:r>
+      <w:r>
+        <w:t xml:space="preserve">— her şeyi onunla elemek bütçeyi işe yaramaz makalelere harcamak olurdu.</w:t>
       </w:r>
     </w:p>
     <w:p>
@@ -2461,13 +2506,13 @@
         <w:rPr>
           <w:b/>
         </w:rPr>
-        <w:t xml:space="preserve">üç-aşamalı huni:</w:t>
-      </w:r>
-      <w:r>
-        <w:t xml:space="preserve"> </w:t>
-      </w:r>
-      <w:r>
-        <w:t xml:space="preserve">ucuz eleyici (Gemma ~1.500/gün) → orta yeniden-sıralayıcı (Flash-Lite ~500/gün) → pahalı çıkarıcı (Gemini ~20/gün).</w:t>
+        <w:t xml:space="preserve">üç aşamalı huni:</w:t>
+      </w:r>
+      <w:r>
+        <w:t xml:space="preserve"> </w:t>
+      </w:r>
+      <w:r>
+        <w:t xml:space="preserve">ucuz eleyici (Gemma ~1.500/gün) → orta yeniden sıralayıcı (Flash-Lite ~500/gün) → pahalı çıkarıcı (Gemini ~20/gün).</w:t>
       </w:r>
     </w:p>
     <w:p>
@@ -2482,25 +2527,25 @@
         <w:rPr>
           <w:b/>
         </w:rPr>
-        <w:t xml:space="preserve">Bir öncelik puanı onu huni yapar:</w:t>
-      </w:r>
-      <w:r>
-        <w:t xml:space="preserve"> </w:t>
-      </w:r>
-      <w:r>
-        <w:t xml:space="preserve">her aşama, en eski değil, yararlılığa göre</w:t>
-      </w:r>
-      <w:r>
-        <w:t xml:space="preserve"> </w:t>
-      </w:r>
-      <w:r>
-        <w:rPr>
-          <w:b/>
-        </w:rPr>
-        <w:t xml:space="preserve">en iyi-N</w:t>
-      </w:r>
-      <w:r>
-        <w:t xml:space="preserve">’yi işler — böylece 20 çağrı en iyi adaylara düşer.</w:t>
+        <w:t xml:space="preserve">Onu huni yapan bir öncelik puanı:</w:t>
+      </w:r>
+      <w:r>
+        <w:t xml:space="preserve"> </w:t>
+      </w:r>
+      <w:r>
+        <w:t xml:space="preserve">her aşama, en eskiyi değil, yararlılığa göre</w:t>
+      </w:r>
+      <w:r>
+        <w:t xml:space="preserve"> </w:t>
+      </w:r>
+      <w:r>
+        <w:rPr>
+          <w:b/>
+        </w:rPr>
+        <w:t xml:space="preserve">en iyi N</w:t>
+      </w:r>
+      <w:r>
+        <w:t xml:space="preserve">’yi işler — böylece o 20 çağrı en iyi adaylara gider.</w:t>
       </w:r>
     </w:p>
     <w:p>
@@ -2512,16 +2557,16 @@
         <w:pStyle w:val="Compact"/>
       </w:pPr>
       <w:r>
-        <w:t xml:space="preserve">Hattın şekli</w:t>
-      </w:r>
-      <w:r>
-        <w:t xml:space="preserve"> </w:t>
-      </w:r>
-      <w:r>
-        <w:rPr>
-          <w:b/>
-        </w:rPr>
-        <w:t xml:space="preserve">kod değil, veridir</w:t>
+        <w:t xml:space="preserve">Hattın biçimi</w:t>
+      </w:r>
+      <w:r>
+        <w:t xml:space="preserve"> </w:t>
+      </w:r>
+      <w:r>
+        <w:rPr>
+          <w:b/>
+        </w:rPr>
+        <w:t xml:space="preserve">kodda değil, veride</w:t>
       </w:r>
       <w:r>
         <w:t xml:space="preserve"> </w:t>
@@ -2556,9 +2601,9 @@
       <w:pPr>
         <w:pStyle w:val="Heading2"/>
       </w:pPr>
-      <w:bookmarkStart w:id="31" w:name="X1eb5dc83c6b940968b992b0a620f61bfdf1bf88"/>
-      <w:r>
-        <w:t xml:space="preserve">Slayt 10 — 3) Üç model boyunca tek sözleşme — gerçeklikten sağ çıkmak</w:t>
+      <w:bookmarkStart w:id="31" w:name="X4d99a614809ffaf745c9f81c93628dd9358fef8"/>
+      <w:r>
+        <w:t xml:space="preserve">Slayt 10 — 3) Üç model, tek sözleşme — gerçeklikten sağ çıkmak</w:t>
       </w:r>
       <w:bookmarkEnd w:id="31"/>
     </w:p>
@@ -2576,40 +2621,43 @@
         <w:rPr>
           <w:b/>
         </w:rPr>
-        <w:t xml:space="preserve">GÖRSEL — kod/JSON illüstrasyonu:</w:t>
-      </w:r>
-      <w:r>
-        <w:t xml:space="preserve"> </w:t>
-      </w:r>
-      <w:r>
-        <w:t xml:space="preserve">üç model simgesini besleyen tek bir</w:t>
-      </w:r>
-      <w:r>
-        <w:t xml:space="preserve"> </w:t>
-      </w:r>
-      <w:r>
-        <w:rPr>
-          <w:b/>
-        </w:rPr>
-        <w:t xml:space="preserve">paylaşılan prompt</w:t>
-      </w:r>
-      <w:r>
-        <w:t xml:space="preserve">; altında, dört farklı-şekilli JSON bloğu (nesne · çıplak dizi · 1-elemanlı dizi · iç içe food→nutrients) hepsi</w:t>
-      </w:r>
-      <w:r>
-        <w:t xml:space="preserve"> </w:t>
-      </w:r>
-      <w:r>
-        <w:rPr>
-          <w:b/>
-        </w:rPr>
-        <w:t xml:space="preserve">tek kanonik köke</w:t>
-      </w:r>
-      <w:r>
-        <w:t xml:space="preserve"> </w:t>
-      </w:r>
-      <w:r>
-        <w:t xml:space="preserve">iniyor. Ek:</w:t>
+        <w:t xml:space="preserve">GÖRSEL — kod/JSON çizimi:</w:t>
+      </w:r>
+      <w:r>
+        <w:t xml:space="preserve"> </w:t>
+      </w:r>
+      <w:r>
+        <w:t xml:space="preserve">tek bir</w:t>
+      </w:r>
+      <w:r>
+        <w:t xml:space="preserve"> </w:t>
+      </w:r>
+      <w:r>
+        <w:rPr>
+          <w:b/>
+        </w:rPr>
+        <w:t xml:space="preserve">ortak prompt</w:t>
+      </w:r>
+      <w:r>
+        <w:t xml:space="preserve"> </w:t>
+      </w:r>
+      <w:r>
+        <w:t xml:space="preserve">üç model simgesini besliyor; altında, dört farklı biçimli JSON (nesne · düz dizi · tek elemanlı dizi · iç içe food→nutrients) hepsi</w:t>
+      </w:r>
+      <w:r>
+        <w:t xml:space="preserve"> </w:t>
+      </w:r>
+      <w:r>
+        <w:rPr>
+          <w:b/>
+        </w:rPr>
+        <w:t xml:space="preserve">tek bir kanonik köke</w:t>
+      </w:r>
+      <w:r>
+        <w:t xml:space="preserve"> </w:t>
+      </w:r>
+      <w:r>
+        <w:t xml:space="preserve">iniyor. Köşe notu:</w:t>
       </w:r>
       <w:r>
         <w:t xml:space="preserve"> </w:t>
@@ -2639,7 +2687,7 @@
         <w:t xml:space="preserve">“</w:t>
       </w:r>
       <w:r>
-        <w:t xml:space="preserve">Geçerli-ama-farklı-şekilli çıktı kurtarılır, bir döngüye yeniden-denenmez.</w:t>
+        <w:t xml:space="preserve">Geçerli ama farklı biçimli çıktı kurtarılır, bir döngüye girip tekrar denenmez.</w:t>
       </w:r>
       <w:r>
         <w:t xml:space="preserve">”</w:t>
@@ -2711,7 +2759,7 @@
         <w:t xml:space="preserve"> </w:t>
       </w:r>
       <w:r>
-        <w:t xml:space="preserve">nedir vs. neyin boş olduğu (müdahaleler, tek-seferlik formülasyonlar, derlemeler).</w:t>
+        <w:t xml:space="preserve">nedir, neyin boş sayıldığı (müdahaleler, tek seferlik formülasyonlar, derlemeler).</w:t>
       </w:r>
     </w:p>
     <w:p>
@@ -2732,7 +2780,7 @@
         <w:rPr>
           <w:b/>
         </w:rPr>
-        <w:t xml:space="preserve">kanıt metadata’sı</w:t>
+        <w:t xml:space="preserve">kanıt meta verisi</w:t>
       </w:r>
       <w:r>
         <w:t xml:space="preserve"> </w:t>
@@ -2759,7 +2807,7 @@
         <w:t xml:space="preserve">page_hint</w:t>
       </w:r>
       <w:r>
-        <w:t xml:space="preserve">, ≤20-kelime birebir</w:t>
+        <w:t xml:space="preserve">, en fazla 20 kelimelik birebir bir</w:t>
       </w:r>
       <w:r>
         <w:t xml:space="preserve"> </w:t>
@@ -2792,7 +2840,7 @@
         <w:rPr>
           <w:b/>
         </w:rPr>
-        <w:t xml:space="preserve">PDF sayfa indeksidir, asla basılı sayfa değil</w:t>
+        <w:t xml:space="preserve">PDF sayfa numarasıdır, asla basılı sayfa değil</w:t>
       </w:r>
       <w:r>
         <w:t xml:space="preserve"> </w:t>
@@ -2813,28 +2861,28 @@
         <w:rPr>
           <w:b/>
         </w:rPr>
-        <w:t xml:space="preserve">JSON sapmasından sağ çıkıldı:</w:t>
-      </w:r>
-      <w:r>
-        <w:t xml:space="preserve"> </w:t>
-      </w:r>
-      <w:r>
-        <w:t xml:space="preserve">markdown çitlerini soy, elle yazılmış dengeli-parantez tarayıcısı,</w:t>
-      </w:r>
-      <w:r>
-        <w:t xml:space="preserve"> </w:t>
-      </w:r>
-      <w:r>
-        <w:rPr>
-          <w:b/>
-        </w:rPr>
-        <w:t xml:space="preserve">4 kabul edilen şekil</w:t>
-      </w:r>
-      <w:r>
-        <w:t xml:space="preserve"> </w:t>
-      </w:r>
-      <w:r>
-        <w:t xml:space="preserve">→ tek kök; kötü bir satır düşürülür, ölümcül değil.</w:t>
+        <w:t xml:space="preserve">Bozuk JSON’dan sağ çıkma:</w:t>
+      </w:r>
+      <w:r>
+        <w:t xml:space="preserve"> </w:t>
+      </w:r>
+      <w:r>
+        <w:t xml:space="preserve">markdown çitlerini temizle, elle yazılmış bir dengeli parantez tarayıcısı,</w:t>
+      </w:r>
+      <w:r>
+        <w:t xml:space="preserve"> </w:t>
+      </w:r>
+      <w:r>
+        <w:rPr>
+          <w:b/>
+        </w:rPr>
+        <w:t xml:space="preserve">4 farklı biçim</w:t>
+      </w:r>
+      <w:r>
+        <w:t xml:space="preserve"> </w:t>
+      </w:r>
+      <w:r>
+        <w:t xml:space="preserve">→ tek bir kök; hatalı bir satır atılır, hata sayılmaz.</w:t>
       </w:r>
     </w:p>
     <w:p>
@@ -2849,7 +2897,7 @@
         <w:rPr>
           <w:b/>
         </w:rPr>
-        <w:t xml:space="preserve">Güçlü aşama için yerel PDF</w:t>
+        <w:t xml:space="preserve">Güçlü aşama için doğrudan PDF</w:t>
       </w:r>
       <w:r>
         <w:t xml:space="preserve"> </w:t>
@@ -2864,13 +2912,10 @@
         <w:rPr>
           <w:b/>
         </w:rPr>
-        <w:t xml:space="preserve">Gemma metin-modu kalır</w:t>
-      </w:r>
-      <w:r>
-        <w:t xml:space="preserve"> </w:t>
-      </w:r>
-      <w:r>
-        <w:t xml:space="preserve">çünkü</w:t>
+        <w:t xml:space="preserve">Gemma metin modunda kalır</w:t>
+      </w:r>
+      <w:r>
+        <w:t xml:space="preserve">, çünkü</w:t>
       </w:r>
       <w:r>
         <w:t xml:space="preserve"> </w:t>
@@ -2885,7 +2930,7 @@
         <w:t xml:space="preserve"> </w:t>
       </w:r>
       <w:r>
-        <w:t xml:space="preserve">zaman aşımına uğradığı ölçüldü — ~1.500/gün’de ölümcül. Karar, geri alınmaması için kodlandı + belgelendi.</w:t>
+        <w:t xml:space="preserve">zaman aşımına uğradığı ölçüldü — günde ~1.500’de ölümcül. Karar, geri alınmasın diye kodda ve dokümanda sabitlendi.</w:t>
       </w:r>
     </w:p>
     <w:p>
@@ -2925,16 +2970,16 @@
         <w:t xml:space="preserve"> </w:t>
       </w:r>
       <w:r>
-        <w:t xml:space="preserve">bir model satırı soldan-sağa kapılardan geçiyor —</w:t>
-      </w:r>
-      <w:r>
-        <w:t xml:space="preserve"> </w:t>
-      </w:r>
-      <w:r>
-        <w:rPr>
-          <w:b/>
-        </w:rPr>
-        <w:t xml:space="preserve">zorunlu-alan → birim politikası (7 birim; kuru-madde reddedilir) → referans çözümleme (ID→ad→takma; belirsiz→hiçbiri) → deterministik sıra + round(6) → SHA-256.</w:t>
+        <w:t xml:space="preserve">bir model satırı soldan sağa kapılardan geçiyor —</w:t>
+      </w:r>
+      <w:r>
+        <w:t xml:space="preserve"> </w:t>
+      </w:r>
+      <w:r>
+        <w:rPr>
+          <w:b/>
+        </w:rPr>
+        <w:t xml:space="preserve">zorunlu alan → birim politikası (7 birim; kuru madde reddedilir) → referans çözümleme (ID→ad→takma ad; belirsiz→hiçbiri) → deterministik sıra + round(6) → SHA-256.</w:t>
       </w:r>
       <w:r>
         <w:t xml:space="preserve"> </w:t>
@@ -2955,7 +3000,7 @@
         <w:t xml:space="preserve"> </w:t>
       </w:r>
       <w:r>
-        <w:t xml:space="preserve">paneli ekran görüntüsü (Güven, Kabul/giriş satır, red-nedeni rozetleri).</w:t>
+        <w:t xml:space="preserve">paneli ekran görüntüsü (Güven, Kabul/giriş satır sayısı, ret nedeni rozetleri).</w:t>
       </w:r>
       <w:r>
         <w:t xml:space="preserve"> </w:t>
@@ -2973,7 +3018,7 @@
         <w:t xml:space="preserve">“</w:t>
       </w:r>
       <w:r>
-        <w:t xml:space="preserve">Model çıktısı, bir insanın göndereceği tam şekle dönüştürülmüş — ve her satırın neden düşürüldüğünün kaydı.</w:t>
+        <w:t xml:space="preserve">Model çıktısı, bir insanın göndereceği yapıya çevriliyor — ve her satırın neden atıldığının kaydı tutuluyor.</w:t>
       </w:r>
       <w:r>
         <w:t xml:space="preserve">”</w:t>
@@ -2988,22 +3033,22 @@
         <w:pStyle w:val="Compact"/>
       </w:pPr>
       <w:r>
-        <w:t xml:space="preserve">Bir modelin ham çıktısı veritabanı verisi değildir — bir insanın gönderdiği</w:t>
-      </w:r>
-      <w:r>
-        <w:t xml:space="preserve"> </w:t>
-      </w:r>
-      <w:r>
-        <w:rPr>
-          <w:b/>
-        </w:rPr>
-        <w:t xml:space="preserve">tam aynı normalize şekle</w:t>
-      </w:r>
-      <w:r>
-        <w:t xml:space="preserve"> </w:t>
-      </w:r>
-      <w:r>
-        <w:t xml:space="preserve">dönüşmeli.</w:t>
+        <w:t xml:space="preserve">Bir modelin ham çıktısı veritabanı verisi değildir — bir insanın göndereceği</w:t>
+      </w:r>
+      <w:r>
+        <w:t xml:space="preserve"> </w:t>
+      </w:r>
+      <w:r>
+        <w:rPr>
+          <w:b/>
+        </w:rPr>
+        <w:t xml:space="preserve">yapıyla birebir aynı</w:t>
+      </w:r>
+      <w:r>
+        <w:t xml:space="preserve"> </w:t>
+      </w:r>
+      <w:r>
+        <w:t xml:space="preserve">hâle gelmeli.</w:t>
       </w:r>
     </w:p>
     <w:p>
@@ -3039,19 +3084,19 @@
         <w:t xml:space="preserve"> </w:t>
       </w:r>
       <w:r>
-        <w:t xml:space="preserve">sağ kalır; per-100g zorunlu,</w:t>
-      </w:r>
-      <w:r>
-        <w:t xml:space="preserve"> </w:t>
-      </w:r>
-      <w:r>
-        <w:rPr>
-          <w:b/>
-        </w:rPr>
-        <w:t xml:space="preserve">kuru-madde reddedilir</w:t>
-      </w:r>
-      <w:r>
-        <w:t xml:space="preserve">, taze/yaş/olduğu-gibi kabul.</w:t>
+        <w:t xml:space="preserve">geçer; 100 g üzerinden zorunlu,</w:t>
+      </w:r>
+      <w:r>
+        <w:t xml:space="preserve"> </w:t>
+      </w:r>
+      <w:r>
+        <w:rPr>
+          <w:b/>
+        </w:rPr>
+        <w:t xml:space="preserve">kuru madde reddedilir</w:t>
+      </w:r>
+      <w:r>
+        <w:t xml:space="preserve">, taze/yaş/olduğu gibi kabul.</w:t>
       </w:r>
     </w:p>
     <w:p>
@@ -3072,7 +3117,7 @@
         <w:t xml:space="preserve"> </w:t>
       </w:r>
       <w:r>
-        <w:t xml:space="preserve">iddia edilen bir DB id’sini</w:t>
+        <w:t xml:space="preserve">verilen bir veritabanı ID’sini doğrula,</w:t>
       </w:r>
       <w:r>
         <w:t xml:space="preserve"> </w:t>
@@ -3081,13 +3126,13 @@
         <w:rPr>
           <w:i/>
         </w:rPr>
-        <w:t xml:space="preserve">ve</w:t>
-      </w:r>
-      <w:r>
-        <w:t xml:space="preserve"> </w:t>
-      </w:r>
-      <w:r>
-        <w:t xml:space="preserve">adının eşleştiğini doğrula;</w:t>
+        <w:t xml:space="preserve">üstelik</w:t>
+      </w:r>
+      <w:r>
+        <w:t xml:space="preserve"> </w:t>
+      </w:r>
+      <w:r>
+        <w:t xml:space="preserve">adının da eşleştiğini kontrol et;</w:t>
       </w:r>
       <w:r>
         <w:t xml:space="preserve"> </w:t>
@@ -3102,7 +3147,7 @@
         <w:t xml:space="preserve"> </w:t>
       </w:r>
       <w:r>
-        <w:t xml:space="preserve">(asla yanlış bağ); çözülmemiş gıdalar/besinler açık</w:t>
+        <w:t xml:space="preserve">(asla yanlış bağ yok); çözülemeyen gıda/besinler açıkça</w:t>
       </w:r>
       <w:r>
         <w:t xml:space="preserve"> </w:t>
@@ -3117,7 +3162,7 @@
         <w:t xml:space="preserve"> </w:t>
       </w:r>
       <w:r>
-        <w:t xml:space="preserve">satırlar olarak tutulur.</w:t>
+        <w:t xml:space="preserve">satır olarak tutulur.</w:t>
       </w:r>
     </w:p>
     <w:p>
@@ -3163,7 +3208,7 @@
         <w:t xml:space="preserve"> </w:t>
       </w:r>
       <w:r>
-        <w:t xml:space="preserve">— böylece bir YZ çıkarımı bir insan gönderisiyle bayt-bayt kıyaslanabilir ve bir</w:t>
+        <w:t xml:space="preserve">— böylece bir YZ çıkarımı bir insan gönderisiyle bayt bayt karşılaştırılabilir ve bir</w:t>
       </w:r>
       <w:r>
         <w:t xml:space="preserve"> </w:t>
@@ -3193,7 +3238,7 @@
         <w:t xml:space="preserve"> </w:t>
       </w:r>
       <w:r>
-        <w:t xml:space="preserve">düştüğünü gösterir.</w:t>
+        <w:t xml:space="preserve">atıldığını gösterir.</w:t>
       </w:r>
     </w:p>
     <w:p>
@@ -3207,9 +3252,9 @@
       <w:pPr>
         <w:pStyle w:val="Heading2"/>
       </w:pPr>
-      <w:bookmarkStart w:id="33" w:name="X4e0fedea5411a7bf3f0fd06ea8f48cc6084c6e7"/>
-      <w:r>
-        <w:t xml:space="preserve">Slayt 12 — 4) Güven kapısı — tut, ya da bir insana gönder?</w:t>
+      <w:bookmarkStart w:id="33" w:name="Xb76f270e2ce055988f12b7e943c3ef98a3145db"/>
+      <w:r>
+        <w:t xml:space="preserve">Slayt 12 — 4) Güven kapısı — tut, yoksa bir insana gönder?</w:t>
       </w:r>
       <w:bookmarkEnd w:id="33"/>
     </w:p>
@@ -3233,16 +3278,16 @@
         <w:t xml:space="preserve"> </w:t>
       </w:r>
       <w:r>
-        <w:t xml:space="preserve">bir eksen üzerinde iki eşikli güven; oklar —</w:t>
-      </w:r>
-      <w:r>
-        <w:t xml:space="preserve"> </w:t>
-      </w:r>
-      <w:r>
-        <w:rPr>
-          <w:b/>
-        </w:rPr>
-        <w:t xml:space="preserve">düşük-güven → İnsan kuyruğu · yüksek-pozitif → otomatik-kesinleştirilmiş · otomatik-kesinleştirilmişin örneklenen bir dilimi → İnsana geri zorlanır (AUDIT).</w:t>
+        <w:t xml:space="preserve">üzerinde iki eşik olan bir güven ekseni; oklar —</w:t>
+      </w:r>
+      <w:r>
+        <w:t xml:space="preserve"> </w:t>
+      </w:r>
+      <w:r>
+        <w:rPr>
+          <w:b/>
+        </w:rPr>
+        <w:t xml:space="preserve">düşük güven → İnsan kuyruğu · yüksek + olumlu → otomatik kesinleştirilir · otomatik kesinleştirilenlerin örneklenmiş bir kısmı → İnsana geri zorlanır (AUDIT).</w:t>
       </w:r>
       <w:r>
         <w:t xml:space="preserve"> </w:t>
@@ -3311,7 +3356,25 @@
         <w:t xml:space="preserve">“</w:t>
       </w:r>
       <w:r>
-        <w:t xml:space="preserve">Bu, ’YZ önerir, insan emin olmadıklarını doğrular’ın kesin, yeniden-üretilebilir ve kendini-kontrol eden hâli.</w:t>
+        <w:t xml:space="preserve">Bu,</w:t>
+      </w:r>
+      <w:r>
+        <w:t xml:space="preserve"> </w:t>
+      </w:r>
+      <w:r>
+        <w:t xml:space="preserve">‘</w:t>
+      </w:r>
+      <w:r>
+        <w:t xml:space="preserve">YZ önerir, insan emin olunmayanları doğrular</w:t>
+      </w:r>
+      <w:r>
+        <w:t xml:space="preserve">’</w:t>
+      </w:r>
+      <w:r>
+        <w:t xml:space="preserve"> </w:t>
+      </w:r>
+      <w:r>
+        <w:t xml:space="preserve">fikrinin kesin, tekrarlanabilir ve kendini kontrol eden hâli.</w:t>
       </w:r>
       <w:r>
         <w:t xml:space="preserve">”</w:t>
@@ -3335,7 +3398,7 @@
         <w:t xml:space="preserve"> </w:t>
       </w:r>
       <w:r>
-        <w:t xml:space="preserve">her makale, aşamanın kendi eşiklerine karşı yüksek/düşük × pozitif/negatif kümelenir.</w:t>
+        <w:t xml:space="preserve">her makale, aşamanın kendi eşiklerine göre yüksek/düşük × olumlu/olumsuz olarak gruplanır.</w:t>
       </w:r>
     </w:p>
     <w:p>
@@ -3359,7 +3422,7 @@
         <w:rPr>
           <w:b/>
         </w:rPr>
-        <w:t xml:space="preserve">düşük-güven → insan etiketleme kuyruğu</w:t>
+        <w:t xml:space="preserve">düşük güven → insan etiketleme kuyruğu</w:t>
       </w:r>
       <w:r>
         <w:t xml:space="preserve">;</w:t>
@@ -3371,10 +3434,10 @@
         <w:rPr>
           <w:b/>
         </w:rPr>
-        <w:t xml:space="preserve">yüksek-güven-pozitif → otomatik-kesinleştirilir</w:t>
-      </w:r>
-      <w:r>
-        <w:t xml:space="preserve">; zaten insan gerçeği olan bir makalenin üzerine asla yazılmaz.</w:t>
+        <w:t xml:space="preserve">yüksek güven + olumlu → otomatik kesinleştirilir</w:t>
+      </w:r>
+      <w:r>
+        <w:t xml:space="preserve">; zaten insan doğrusu olan bir makalenin üzerine asla yazılmaz.</w:t>
       </w:r>
     </w:p>
     <w:p>
@@ -3389,7 +3452,7 @@
         <w:rPr>
           <w:b/>
         </w:rPr>
-        <w:t xml:space="preserve">Otomatik-kabuller güvenilmez, denetlenir:</w:t>
+        <w:t xml:space="preserve">Otomatik kabuller körü körüne güvenilmez, denetlenir:</w:t>
       </w:r>
       <w:r>
         <w:t xml:space="preserve"> </w:t>
@@ -3443,7 +3506,7 @@
         <w:t xml:space="preserve"> </w:t>
       </w:r>
       <w:r>
-        <w:t xml:space="preserve">ve yüksek-güvenli kesinleştirmelerin bile örneklenen bir kesrini bir insana geri zorlar — otomatik yol üzerinde sürekli kalite kontrolü.</w:t>
+        <w:t xml:space="preserve">ve yüksek güvenli kesinleştirmelerin bile örneklenmiş bir kısmını bir insana geri zorlar — otomatik yol üzerinde sürekli kalite kontrolü.</w:t>
       </w:r>
     </w:p>
     <w:p>
@@ -3458,13 +3521,13 @@
         <w:rPr>
           <w:b/>
         </w:rPr>
-        <w:t xml:space="preserve">Tamamen yeniden-üretilebilir + denetlenebilir:</w:t>
-      </w:r>
-      <w:r>
-        <w:t xml:space="preserve"> </w:t>
-      </w:r>
-      <w:r>
-        <w:t xml:space="preserve">aynı makale → aynı karar, her seferinde, ve nedenini her zaman görebilirsiniz.</w:t>
+        <w:t xml:space="preserve">Tamamen tekrarlanabilir + denetlenebilir:</w:t>
+      </w:r>
+      <w:r>
+        <w:t xml:space="preserve"> </w:t>
+      </w:r>
+      <w:r>
+        <w:t xml:space="preserve">aynı makale → her zaman aynı karar, ve nedenini her zaman görebilirsin.</w:t>
       </w:r>
       <w:r>
         <w:t xml:space="preserve"> </w:t>
@@ -3473,7 +3536,7 @@
         <w:rPr>
           <w:i/>
         </w:rPr>
-        <w:t xml:space="preserve">(Sistemin ölçeklenen kısmı budur — insan yalnızca belirsiz makaleleri görür.)</w:t>
+        <w:t xml:space="preserve">(Sistemin ölçeklenen kısmı bu — insan yalnızca belirsiz makaleleri görür.)</w:t>
       </w:r>
     </w:p>
     <w:p>
@@ -3487,9 +3550,9 @@
       <w:pPr>
         <w:pStyle w:val="Heading2"/>
       </w:pPr>
-      <w:bookmarkStart w:id="34" w:name="slayt-13-5-geri-besleme-öğrenme-döngüsü"/>
-      <w:r>
-        <w:t xml:space="preserve">Slayt 13 — 5) Geri besleme-öğrenme döngüsü</w:t>
+      <w:bookmarkStart w:id="34" w:name="X5411e950eec87e3cd6b74dec003ad773753e5a3"/>
+      <w:r>
+        <w:t xml:space="preserve">Slayt 13 — 5) Geri besleme ile öğrenme döngüsü</w:t>
       </w:r>
       <w:bookmarkEnd w:id="34"/>
     </w:p>
@@ -3516,13 +3579,13 @@
         <w:rPr>
           <w:b/>
         </w:rPr>
-        <w:t xml:space="preserve">insan onayları (paper_review_outcomes) → log-odds n-gram puanlama (iyi / kötü / arka plan) → latest.json → tarayıcı sonraki sefer daha iyi sıralar → daha çok iyi makale → daha çok onay.</w:t>
-      </w:r>
-      <w:r>
-        <w:t xml:space="preserve"> </w:t>
-      </w:r>
-      <w:r>
-        <w:t xml:space="preserve">YZ-sonuçları düğümüne</w:t>
+        <w:t xml:space="preserve">insan onayları (paper_review_outcomes) → log-odds n-gram puanlaması (iyi / kötü / arka plan) → latest.json → tarayıcı sonraki sefer daha iyi sıralar → daha çok iyi makale → daha çok onay.</w:t>
+      </w:r>
+      <w:r>
+        <w:t xml:space="preserve"> </w:t>
+      </w:r>
+      <w:r>
+        <w:t xml:space="preserve">YZ sonuçları düğümüne</w:t>
       </w:r>
       <w:r>
         <w:t xml:space="preserve"> </w:t>
@@ -3540,7 +3603,7 @@
         <w:t xml:space="preserve"> </w:t>
       </w:r>
       <w:r>
-        <w:t xml:space="preserve">damgası (döngüden çıkarılarak üstü çizili).</w:t>
+        <w:t xml:space="preserve">damgası (döngüden çıkarılmış, üstü çizili).</w:t>
       </w:r>
       <w:r>
         <w:t xml:space="preserve"> </w:t>
@@ -3558,7 +3621,7 @@
         <w:t xml:space="preserve">“</w:t>
       </w:r>
       <w:r>
-        <w:t xml:space="preserve">Statik bir anahtar-kelime tarayıcısı ile gelişen bir araştırma hattı arasındaki fark.</w:t>
+        <w:t xml:space="preserve">Sabit bir anahtar kelime tarayıcısı ile gelişen bir araştırma hattı arasındaki fark.</w:t>
       </w:r>
       <w:r>
         <w:t xml:space="preserve">”</w:t>
@@ -3588,7 +3651,7 @@
         <w:t xml:space="preserve"> </w:t>
       </w:r>
       <w:r>
-        <w:t xml:space="preserve">bir makaleyi öngördüğüne dair kanıttır — ve</w:t>
+        <w:t xml:space="preserve">bir makaleyi işaret ettiğine dair bir kanıt — ve</w:t>
       </w:r>
       <w:r>
         <w:t xml:space="preserve"> </w:t>
@@ -3618,7 +3681,7 @@
         <w:rPr>
           <w:b/>
         </w:rPr>
-        <w:t xml:space="preserve">Kendi üzerinde asla eğitilmez:</w:t>
+        <w:t xml:space="preserve">Asla kendi üzerinde eğitilmez:</w:t>
       </w:r>
       <w:r>
         <w:t xml:space="preserve"> </w:t>
@@ -3639,7 +3702,7 @@
         <w:t xml:space="preserve"> </w:t>
       </w:r>
       <w:r>
-        <w:t xml:space="preserve">sonuçları sayılır; YZ-kesinleştirilmiş olanlar dışlanır; açık çakışmalar ve bekleyen gönderiler öğretmez.</w:t>
+        <w:t xml:space="preserve">sonuçları sayılır; YZ’nin kesinleştirdikleri dışlanır; açık çakışmalar ve bekleyen gönderiler öğretmez.</w:t>
       </w:r>
     </w:p>
     <w:p>
@@ -3660,22 +3723,19 @@
         <w:t xml:space="preserve"> </w:t>
       </w:r>
       <w:r>
-        <w:t xml:space="preserve">—</w:t>
-      </w:r>
-      <w:r>
-        <w:t xml:space="preserve"> </w:t>
-      </w:r>
-      <w:r>
-        <w:rPr>
-          <w:b/>
-        </w:rPr>
-        <w:t xml:space="preserve">arka plan kovası</w:t>
-      </w:r>
-      <w:r>
-        <w:t xml:space="preserve"> </w:t>
-      </w:r>
-      <w:r>
-        <w:t xml:space="preserve">hiledir: yaygın kelimeleri değil, yararlı makalelere</w:t>
+        <w:t xml:space="preserve">— asıl numara</w:t>
+      </w:r>
+      <w:r>
+        <w:t xml:space="preserve"> </w:t>
+      </w:r>
+      <w:r>
+        <w:rPr>
+          <w:b/>
+        </w:rPr>
+        <w:t xml:space="preserve">arka plan grubu</w:t>
+      </w:r>
+      <w:r>
+        <w:t xml:space="preserve">: sıradan kelimeleri değil, yararlı makalelere</w:t>
       </w:r>
       <w:r>
         <w:t xml:space="preserve"> </w:t>
@@ -3690,7 +3750,7 @@
         <w:t xml:space="preserve"> </w:t>
       </w:r>
       <w:r>
-        <w:t xml:space="preserve">terimleri öne çıkarır. Başlık vs. başlık+özet ayrı puanlanır (bir başlık ifadesi daha güçlü kanıttır).</w:t>
+        <w:t xml:space="preserve">terimleri öne çıkarır. Başlık ile başlık+özet ayrı puanlanır (bir başlık ifadesi daha güçlü kanıttır).</w:t>
       </w:r>
     </w:p>
     <w:p>
@@ -3705,13 +3765,13 @@
         <w:rPr>
           <w:b/>
         </w:rPr>
-        <w:t xml:space="preserve">Dile-özgü yedi öğrenilmiş havuz</w:t>
-      </w:r>
-      <w:r>
-        <w:t xml:space="preserve"> </w:t>
-      </w:r>
-      <w:r>
-        <w:t xml:space="preserve">üretir (filtre ağırlıkları, sorgu ifadeleri, gömme çapaları, kaynak/çift/batch/konsept puanları) — ve geri besleme bir</w:t>
+        <w:t xml:space="preserve">Her dil için yedi öğrenilmiş havuz</w:t>
+      </w:r>
+      <w:r>
+        <w:t xml:space="preserve"> </w:t>
+      </w:r>
+      <w:r>
+        <w:t xml:space="preserve">üretir (filtre ağırlıkları, sorgu ifadeleri, gömme çapaları, kaynak/çift/batch/kavram puanları) — ve geri besleme bir</w:t>
       </w:r>
       <w:r>
         <w:t xml:space="preserve"> </w:t>
@@ -3723,7 +3783,7 @@
         <w:t xml:space="preserve">yumuşak puandır</w:t>
       </w:r>
       <w:r>
-        <w:t xml:space="preserve">, asla sert-ret değil.</w:t>
+        <w:t xml:space="preserve">, asla doğrudan ret değil.</w:t>
       </w:r>
     </w:p>
     <w:p>
@@ -3739,7 +3799,7 @@
       </w:pPr>
       <w:bookmarkStart w:id="35" w:name="X69674b34cff81d3826c53a5ef9fff6b144051c3"/>
       <w:r>
-        <w:t xml:space="preserve">Slayt 14 — 6) Günlük-operasyon otomasyonu — kendi kendine çalışır, ücretsiz</w:t>
+        <w:t xml:space="preserve">Slayt 14 — 6) Günlük operasyon otomasyonu — kendi kendine çalışır, ücretsiz</w:t>
       </w:r>
       <w:bookmarkEnd w:id="35"/>
     </w:p>
@@ -3757,22 +3817,22 @@
         <w:rPr>
           <w:b/>
         </w:rPr>
-        <w:t xml:space="preserve">GÖRSEL — ops şeması:</w:t>
-      </w:r>
-      <w:r>
-        <w:t xml:space="preserve"> </w:t>
-      </w:r>
-      <w:r>
-        <w:t xml:space="preserve">5 dakikalık bir saat,</w:t>
-      </w:r>
-      <w:r>
-        <w:t xml:space="preserve"> </w:t>
-      </w:r>
-      <w:r>
-        <w:rPr>
-          <w:b/>
-        </w:rPr>
-        <w:t xml:space="preserve">bir serileştirilmiş</w:t>
+        <w:t xml:space="preserve">GÖRSEL — operasyon şeması:</w:t>
+      </w:r>
+      <w:r>
+        <w:t xml:space="preserve"> </w:t>
+      </w:r>
+      <w:r>
+        <w:t xml:space="preserve">beş dakikalık bir saat,</w:t>
+      </w:r>
+      <w:r>
+        <w:t xml:space="preserve"> </w:t>
+      </w:r>
+      <w:r>
+        <w:rPr>
+          <w:b/>
+        </w:rPr>
+        <w:t xml:space="preserve">tek bir</w:t>
       </w:r>
       <w:r>
         <w:rPr>
@@ -3828,7 +3888,7 @@
         <w:t xml:space="preserve"> </w:t>
       </w:r>
       <w:r>
-        <w:t xml:space="preserve">sürüyor; beşi de DB’ye tek bir</w:t>
+        <w:t xml:space="preserve">çalıştırıyor; beşi de veritabanına tek bir</w:t>
       </w:r>
       <w:r>
         <w:t xml:space="preserve"> </w:t>
@@ -3844,7 +3904,7 @@
         <w:t xml:space="preserve"> </w:t>
       </w:r>
       <w:r>
-        <w:t xml:space="preserve">kutusundan işaret ediyor. (Gerçek Pipeline kokpit ekran görüntüsü sonraki slayttadır — bunu temiz bir şema tut.)</w:t>
+        <w:t xml:space="preserve">kutusundan bağlanıyor. (Gerçek Pipeline kokpit ekran görüntüsü sonraki slaytta — bunu sade bir şema olarak tut.)</w:t>
       </w:r>
       <w:r>
         <w:t xml:space="preserve"> </w:t>
@@ -3862,7 +3922,7 @@
         <w:t xml:space="preserve">“</w:t>
       </w:r>
       <w:r>
-        <w:t xml:space="preserve">GitHub-barındırmalı runner’larda ve ücretsiz bir Gemini kotasında gerçek, sürekli bir hat — sunucu yok.</w:t>
+        <w:t xml:space="preserve">GitHub runner’larında ve ücretsiz bir Gemini kotasında çalışan, sürekli ve gerçek bir hat — sunucu yok.</w:t>
       </w:r>
       <w:r>
         <w:t xml:space="preserve">”</w:t>
@@ -3877,7 +3937,7 @@
         <w:pStyle w:val="Compact"/>
       </w:pPr>
       <w:r>
-        <w:t xml:space="preserve">Tüm hat sürekli</w:t>
+        <w:t xml:space="preserve">Tüm hattın sürekli</w:t>
       </w:r>
       <w:r>
         <w:t xml:space="preserve"> </w:t>
@@ -3886,13 +3946,13 @@
         <w:rPr>
           <w:i/>
         </w:rPr>
-        <w:t xml:space="preserve">çalışmalı</w:t>
-      </w:r>
-      <w:r>
-        <w:t xml:space="preserve"> </w:t>
-      </w:r>
-      <w:r>
-        <w:t xml:space="preserve">— tara, günde ~1.500 ele, triyaj yap, çıkar —</w:t>
+        <w:t xml:space="preserve">çalışması</w:t>
+      </w:r>
+      <w:r>
+        <w:t xml:space="preserve"> </w:t>
+      </w:r>
+      <w:r>
+        <w:t xml:space="preserve">gerekiyor — tara, günde ~1.500 ele, triyaj yap, çıkar — hem de</w:t>
       </w:r>
       <w:r>
         <w:t xml:space="preserve"> </w:t>
@@ -3919,28 +3979,28 @@
         <w:rPr>
           <w:b/>
         </w:rPr>
-        <w:t xml:space="preserve">Bir serileştirilmiş denetleyici</w:t>
-      </w:r>
-      <w:r>
-        <w:t xml:space="preserve"> </w:t>
-      </w:r>
-      <w:r>
-        <w:t xml:space="preserve">(tarama yapabilen tek iş; tarama ortasında asla öldürülmez)</w:t>
-      </w:r>
-      <w:r>
-        <w:t xml:space="preserve"> </w:t>
-      </w:r>
-      <w:r>
-        <w:rPr>
-          <w:b/>
-        </w:rPr>
-        <w:t xml:space="preserve">+ beş paralel boşaltma işçisi</w:t>
-      </w:r>
-      <w:r>
-        <w:t xml:space="preserve"> </w:t>
-      </w:r>
-      <w:r>
-        <w:t xml:space="preserve">(kapısız —</w:t>
+        <w:t xml:space="preserve">Tek bir controller</w:t>
+      </w:r>
+      <w:r>
+        <w:t xml:space="preserve"> </w:t>
+      </w:r>
+      <w:r>
+        <w:t xml:space="preserve">(tarama yapabilen tek iş; sürmekte olan bir tarama asla yarıda kesilmez)</w:t>
+      </w:r>
+      <w:r>
+        <w:t xml:space="preserve"> </w:t>
+      </w:r>
+      <w:r>
+        <w:rPr>
+          <w:b/>
+        </w:rPr>
+        <w:t xml:space="preserve">+ beş paralel işçi</w:t>
+      </w:r>
+      <w:r>
+        <w:t xml:space="preserve"> </w:t>
+      </w:r>
+      <w:r>
+        <w:t xml:space="preserve">(controller’a bağlı değil —</w:t>
       </w:r>
       <w:r>
         <w:t xml:space="preserve"> </w:t>
@@ -3949,7 +4009,7 @@
         <w:t xml:space="preserve">“</w:t>
       </w:r>
       <w:r>
-        <w:t xml:space="preserve">denetleyici başarısız olsa bile boşaltma devam etmeli</w:t>
+        <w:t xml:space="preserve">controller başarısız olsa bile işleme devam etmeli</w:t>
       </w:r>
       <w:r>
         <w:t xml:space="preserve">”</w:t>
@@ -3967,16 +4027,7 @@
         <w:pStyle w:val="Compact"/>
       </w:pPr>
       <w:r>
-        <w:t xml:space="preserve">Beş işçi paralel güvenli</w:t>
-      </w:r>
-      <w:r>
-        <w:t xml:space="preserve"> </w:t>
-      </w:r>
-      <w:r>
-        <w:rPr>
-          <w:b/>
-        </w:rPr>
-        <w:t xml:space="preserve">çünkü</w:t>
+        <w:t xml:space="preserve">Beş işçi paralel çalışırken güvenli, çünkü</w:t>
       </w:r>
       <w:r>
         <w:t xml:space="preserve"> </w:t>
@@ -3991,7 +4042,7 @@
         <w:t xml:space="preserve"> </w:t>
       </w:r>
       <w:r>
-        <w:t xml:space="preserve">— her biri ayrık bir görev kümesi alır, kilit yok, koordinasyon yok.</w:t>
+        <w:t xml:space="preserve">— her biri birbirinden bağımsız bir görev kümesi alır, kilit yok, koordinasyon yok.</w:t>
       </w:r>
     </w:p>
     <w:p>
@@ -4006,13 +4057,31 @@
         <w:rPr>
           <w:b/>
         </w:rPr>
-        <w:t xml:space="preserve">Sürdürülebilir bir tık, daemon değil:</w:t>
-      </w:r>
-      <w:r>
-        <w:t xml:space="preserve"> </w:t>
-      </w:r>
-      <w:r>
-        <w:t xml:space="preserve">bayat-görev yeniden-kuyruğu, en-az-deneme-önce sıralama ve 5 dakikalık pencere içinde açık bir dur/dolum karar ağacı — öldürülen ve çakışan runner’lardan sağ çıkar.</w:t>
+        <w:t xml:space="preserve">Sürdürülebilir bir tik, daemon değil:</w:t>
+      </w:r>
+      <w:r>
+        <w:t xml:space="preserve"> </w:t>
+      </w:r>
+      <w:r>
+        <w:t xml:space="preserve">eski görevleri kuyruğa geri alma, en az denenmişi öne alma ve beş dakikalık pencere içinde açık bir</w:t>
+      </w:r>
+      <w:r>
+        <w:t xml:space="preserve"> </w:t>
+      </w:r>
+      <w:r>
+        <w:t xml:space="preserve">“</w:t>
+      </w:r>
+      <w:r>
+        <w:t xml:space="preserve">dur/devam et</w:t>
+      </w:r>
+      <w:r>
+        <w:t xml:space="preserve">”</w:t>
+      </w:r>
+      <w:r>
+        <w:t xml:space="preserve"> </w:t>
+      </w:r>
+      <w:r>
+        <w:t xml:space="preserve">karar ağacı — öldürülen ve çakışan runner’lara rağmen ayakta kalır.</w:t>
       </w:r>
     </w:p>
     <w:p>
@@ -4026,9 +4095,9 @@
       <w:pPr>
         <w:pStyle w:val="Heading2"/>
       </w:pPr>
-      <w:bookmarkStart w:id="36" w:name="Xa2ee4fdd42bdf60edaaff65b3eaba23fd1a2ccf"/>
-      <w:r>
-        <w:t xml:space="preserve">Slayt 15 — 6) Ücretsiz-katman tavanı için mühendislik</w:t>
+      <w:bookmarkStart w:id="36" w:name="X3072ba6feb2c8d5aaaf679ec933343b728b78a7"/>
+      <w:r>
+        <w:t xml:space="preserve">Slayt 15 — 6) Ücretsiz katmanın sınırları için mühendislik</w:t>
       </w:r>
       <w:bookmarkEnd w:id="36"/>
     </w:p>
@@ -4052,7 +4121,7 @@
         <w:t xml:space="preserve"> </w:t>
       </w:r>
       <w:r>
-        <w:t xml:space="preserve">kurduğun</w:t>
+        <w:t xml:space="preserve">senin kurduğun</w:t>
       </w:r>
       <w:r>
         <w:t xml:space="preserve"> </w:t>
@@ -4067,7 +4136,7 @@
         <w:t xml:space="preserve"> </w:t>
       </w:r>
       <w:r>
-        <w:t xml:space="preserve">görünümü —</w:t>
+        <w:t xml:space="preserve">ekranı —</w:t>
       </w:r>
       <w:r>
         <w:t xml:space="preserve"> </w:t>
@@ -4109,7 +4178,7 @@
         <w:rPr>
           <w:b/>
         </w:rPr>
-        <w:t xml:space="preserve">Şu An</w:t>
+        <w:t xml:space="preserve">Right Now</w:t>
       </w:r>
       <w:r>
         <w:rPr>
@@ -4121,7 +4190,7 @@
         <w:t xml:space="preserve"> </w:t>
       </w:r>
       <w:r>
-        <w:t xml:space="preserve">ızgarası. Bu, gerçek operasyonel artefakttır; aşağıdaki dört kısıt onun üstündeki konuşma noktalarıdır.</w:t>
+        <w:t xml:space="preserve">ızgarası. Asıl operasyonel ürün bu; aşağıdaki dört kısıt da onun üstünde anlatılacak konuşma noktaları.</w:t>
       </w:r>
       <w:r>
         <w:t xml:space="preserve"> </w:t>
@@ -4139,7 +4208,7 @@
         <w:t xml:space="preserve">“</w:t>
       </w:r>
       <w:r>
-        <w:t xml:space="preserve">Buradaki her mimari seçim tek bir kısıttan kaynaklanır: bunu ücretsiz yap.</w:t>
+        <w:t xml:space="preserve">Buradaki her mimari seçim tek bir kısıtın sonucu: bunu ücretsiz yap.</w:t>
       </w:r>
       <w:r>
         <w:t xml:space="preserve">”</w:t>
@@ -4157,13 +4226,13 @@
         <w:rPr>
           <w:b/>
         </w:rPr>
-        <w:t xml:space="preserve">İki saat dilimi boyunca kota-günü muhasebesi</w:t>
-      </w:r>
-      <w:r>
-        <w:t xml:space="preserve"> </w:t>
-      </w:r>
-      <w:r>
-        <w:t xml:space="preserve">— Gemma bir UTC gününü; her iki Gemini aşaması Google’ın sıfırlamasıyla eşleşmek için bir</w:t>
+        <w:t xml:space="preserve">İki saat dilimine göre kota günü muhasebesi</w:t>
+      </w:r>
+      <w:r>
+        <w:t xml:space="preserve"> </w:t>
+      </w:r>
+      <w:r>
+        <w:t xml:space="preserve">— Gemma bir UTC gününü; iki Gemini aşaması, Google’ın sıfırlamasına uyması için bir</w:t>
       </w:r>
       <w:r>
         <w:t xml:space="preserve"> </w:t>
@@ -4193,13 +4262,13 @@
         <w:rPr>
           <w:b/>
         </w:rPr>
-        <w:t xml:space="preserve">Üç iç içe duvar-saati bütçesi</w:t>
-      </w:r>
-      <w:r>
-        <w:t xml:space="preserve"> </w:t>
-      </w:r>
-      <w:r>
-        <w:t xml:space="preserve">(denetleyici 75 dk · kısmi-sonuç yazımlı tarayıcı 2.400 sn ·</w:t>
+        <w:t xml:space="preserve">İç içe üç süre sınırı</w:t>
+      </w:r>
+      <w:r>
+        <w:t xml:space="preserve"> </w:t>
+      </w:r>
+      <w:r>
+        <w:t xml:space="preserve">(controller 75 dk · tarayıcı kısmi sonuçları yazarak 2.400 sn · her model çağrısı</w:t>
       </w:r>
       <w:r>
         <w:t xml:space="preserve"> </w:t>
@@ -4214,7 +4283,7 @@
         <w:t xml:space="preserve"> </w:t>
       </w:r>
       <w:r>
-        <w:t xml:space="preserve">ile her model çağrısı 300 sn) — bir yavaş makale iş sınırını aşamaz.</w:t>
+        <w:t xml:space="preserve">ile 300 sn) — tek bir yavaş makale iş süresini aşamaz.</w:t>
       </w:r>
     </w:p>
     <w:p>
@@ -4229,22 +4298,22 @@
         <w:rPr>
           <w:b/>
         </w:rPr>
-        <w:t xml:space="preserve">PDF’ler kaynak-URL/talep-üzerine</w:t>
-      </w:r>
-      <w:r>
-        <w:t xml:space="preserve"> </w:t>
-      </w:r>
-      <w:r>
-        <w:t xml:space="preserve">(onları saklamak Supabase ücretsiz sınırlarını aşardı); bir</w:t>
-      </w:r>
-      <w:r>
-        <w:t xml:space="preserve"> </w:t>
-      </w:r>
-      <w:r>
-        <w:rPr>
-          <w:b/>
-        </w:rPr>
-        <w:t xml:space="preserve">aynı-köken PDF proxy’si</w:t>
+        <w:t xml:space="preserve">PDF’ler kaynak URL’sinden, talep üzerine</w:t>
+      </w:r>
+      <w:r>
+        <w:t xml:space="preserve"> </w:t>
+      </w:r>
+      <w:r>
+        <w:t xml:space="preserve">sunulur (onları saklamak Supabase ücretsiz sınırlarını aşardı); CORS’a takılan yayıncı PDF’lerini bir</w:t>
+      </w:r>
+      <w:r>
+        <w:t xml:space="preserve"> </w:t>
+      </w:r>
+      <w:r>
+        <w:rPr>
+          <w:b/>
+        </w:rPr>
+        <w:t xml:space="preserve">aynı kaynaklı PDF proxy’si</w:t>
       </w:r>
       <w:r>
         <w:t xml:space="preserve"> </w:t>
@@ -4259,16 +4328,16 @@
         <w:t xml:space="preserve">api/pdf.js</w:t>
       </w:r>
       <w:r>
-        <w:t xml:space="preserve">) CORS-dostu-olmayan yayıncı PDF’lerini</w:t>
-      </w:r>
-      <w:r>
-        <w:t xml:space="preserve"> </w:t>
-      </w:r>
-      <w:r>
-        <w:rPr>
-          <w:b/>
-        </w:rPr>
-        <w:t xml:space="preserve">SSRF sağlamlaştırması, bir</w:t>
+        <w:t xml:space="preserve">) çeker:</w:t>
+      </w:r>
+      <w:r>
+        <w:t xml:space="preserve"> </w:t>
+      </w:r>
+      <w:r>
+        <w:rPr>
+          <w:b/>
+        </w:rPr>
+        <w:t xml:space="preserve">SSRF koruması,</w:t>
       </w:r>
       <w:r>
         <w:rPr>
@@ -4293,13 +4362,13 @@
         <w:rPr>
           <w:b/>
         </w:rPr>
-        <w:t xml:space="preserve">sihirli-bayt kontrolü, 25 MB sınırı ve 1-yıllık değişmez önbellekle</w:t>
-      </w:r>
-      <w:r>
-        <w:t xml:space="preserve"> </w:t>
-      </w:r>
-      <w:r>
-        <w:t xml:space="preserve">çeker — her makale yukarı akıştan en fazla bir kez çekilir.</w:t>
+        <w:t xml:space="preserve">sihirli bayt kontrolü, 25 MB sınırı ve 1 yıllık değiştirilemez önbellek</w:t>
+      </w:r>
+      <w:r>
+        <w:t xml:space="preserve"> </w:t>
+      </w:r>
+      <w:r>
+        <w:t xml:space="preserve">— her makale kaynaktan en fazla bir kez çekilir.</w:t>
       </w:r>
     </w:p>
     <w:p>
@@ -4313,9 +4382,9 @@
       <w:pPr>
         <w:pStyle w:val="Heading2"/>
       </w:pPr>
-      <w:bookmarkStart w:id="37" w:name="X098fb4d69b6e91d46b3896e658263dcbca1f719"/>
-      <w:r>
-        <w:t xml:space="preserve">Slayt 16 — 7) Referans veri, testler &amp; dokümantasyon</w:t>
+      <w:bookmarkStart w:id="37" w:name="X1de16e759033f78faabe7545b3753acc04dda61"/>
+      <w:r>
+        <w:t xml:space="preserve">Slayt 16 — 7) Referans verisi, testler ve dokümantasyon</w:t>
       </w:r>
       <w:bookmarkEnd w:id="37"/>
     </w:p>
@@ -4333,7 +4402,7 @@
         <w:rPr>
           <w:b/>
         </w:rPr>
-        <w:t xml:space="preserve">GÖRSEL — gerçek bir test-dosyası kesiti:</w:t>
+        <w:t xml:space="preserve">GÖRSEL — gerçek bir test dosyası kesiti:</w:t>
       </w:r>
       <w:r>
         <w:t xml:space="preserve"> </w:t>
@@ -4345,7 +4414,7 @@
         <w:t xml:space="preserve">test_ai_routing.py</w:t>
       </w:r>
       <w:r>
-        <w:t xml:space="preserve">’den gerçek</w:t>
+        <w:t xml:space="preserve">’deki gerçek</w:t>
       </w:r>
       <w:r>
         <w:t xml:space="preserve"> </w:t>
@@ -4360,7 +4429,7 @@
         <w:t xml:space="preserve"> </w:t>
       </w:r>
       <w:r>
-        <w:t xml:space="preserve">fonksiyon adlarının ekran görüntüsü; değişmezlerin bir spesifikasyonu gibi okunur — örn.</w:t>
+        <w:t xml:space="preserve">fonksiyon adlarının ekran görüntüsü; neredeyse değişmezlerin bir tanımı gibi okunuyor — örn.</w:t>
       </w:r>
       <w:r>
         <w:t xml:space="preserve"> </w:t>
@@ -4408,7 +4477,7 @@
         <w:t xml:space="preserve">build_labels_excludes_ai_model_outcomes</w:t>
       </w:r>
       <w:r>
-        <w:t xml:space="preserve">. (Burada tek somut panel, üç-simgeli bir montajdan iyidir.)</w:t>
+        <w:t xml:space="preserve">. (Burada tek somut bir panel, üç simgeli bir kolajdan daha iyi.)</w:t>
       </w:r>
       <w:r>
         <w:t xml:space="preserve"> </w:t>
@@ -4426,7 +4495,7 @@
         <w:t xml:space="preserve">“</w:t>
       </w:r>
       <w:r>
-        <w:t xml:space="preserve">Bir demo ile altı ay işletilmiş bir sistem arasındaki farkı yapan gösterişsiz katman.</w:t>
+        <w:t xml:space="preserve">Bir demo ile altı ay işletilmiş bir sistem arasındaki farkı yaratan gösterişsiz katman.</w:t>
       </w:r>
       <w:r>
         <w:t xml:space="preserve">”</w:t>
@@ -4444,13 +4513,13 @@
         <w:rPr>
           <w:b/>
         </w:rPr>
-        <w:t xml:space="preserve">Referans ETL:</w:t>
-      </w:r>
-      <w:r>
-        <w:t xml:space="preserve"> </w:t>
-      </w:r>
-      <w:r>
-        <w:t xml:space="preserve">idempotent yükleyiciler USDA FoodData Central’ı kanonik gıdalar/besinlere akıtır — çakışmada upsert +</w:t>
+        <w:t xml:space="preserve">Referans ETL’i:</w:t>
+      </w:r>
+      <w:r>
+        <w:t xml:space="preserve"> </w:t>
+      </w:r>
+      <w:r>
+        <w:t xml:space="preserve">idempotent yükleyiciler USDA FoodData Central’ı kanonik gıda/besinlere aktarır — çakışmada upsert +</w:t>
       </w:r>
       <w:r>
         <w:t xml:space="preserve"> </w:t>
@@ -4462,10 +4531,7 @@
         <w:t xml:space="preserve">deterministik UUID’ler</w:t>
       </w:r>
       <w:r>
-        <w:t xml:space="preserve"> </w:t>
-      </w:r>
-      <w:r>
-        <w:t xml:space="preserve">her referans ID’sini, foreign key’lerin işaret etmesi için kararlı tutar.</w:t>
+        <w:t xml:space="preserve">, her referans ID’sini, yabancı anahtarların işaret etmesi için sabit tutar.</w:t>
       </w:r>
     </w:p>
     <w:p>
@@ -4486,7 +4552,7 @@
         <w:t xml:space="preserve"> </w:t>
       </w:r>
       <w:r>
-        <w:t xml:space="preserve">~5.600 satır; tek başına</w:t>
+        <w:t xml:space="preserve">~5.600 satır; yalnızca</w:t>
       </w:r>
       <w:r>
         <w:t xml:space="preserve"> </w:t>
@@ -4510,7 +4576,7 @@
         <w:t xml:space="preserve"> </w:t>
       </w:r>
       <w:r>
-        <w:t xml:space="preserve">— normalleştirme determinizmi, birim politikası, denetim-örnekleme determinizmi,</w:t>
+        <w:t xml:space="preserve">— normalleştirme determinizmi, birim politikası, denetim örneklemesinin determinizmi,</w:t>
       </w:r>
       <w:r>
         <w:t xml:space="preserve"> </w:t>
@@ -4546,7 +4612,7 @@
         <w:t xml:space="preserve"> </w:t>
       </w:r>
       <w:r>
-        <w:t xml:space="preserve">README / AGENTS / STATE,</w:t>
+        <w:t xml:space="preserve">README / AGENTS / STATE;</w:t>
       </w:r>
       <w:r>
         <w:t xml:space="preserve"> </w:t>
@@ -4561,7 +4627,7 @@
         <w:t xml:space="preserve"> </w:t>
       </w:r>
       <w:r>
-        <w:t xml:space="preserve">Gemma metin-modu,</w:t>
+        <w:t xml:space="preserve">Gemma metin modunda,</w:t>
       </w:r>
       <w:r>
         <w:t xml:space="preserve"> </w:t>
@@ -4576,7 +4642,7 @@
         <w:t xml:space="preserve"> </w:t>
       </w:r>
       <w:r>
-        <w:t xml:space="preserve">tarayıcı vetosu yok,</w:t>
+        <w:t xml:space="preserve">tarayıcıda veto yok,</w:t>
       </w:r>
       <w:r>
         <w:t xml:space="preserve"> </w:t>
@@ -4591,7 +4657,7 @@
         <w:t xml:space="preserve"> </w:t>
       </w:r>
       <w:r>
-        <w:t xml:space="preserve">kaynak-URL PDF’ler olduğunu yakalar — böylece yük taşıyan kararlar geri alınmaz.</w:t>
+        <w:t xml:space="preserve">PDF’ler kaynak URL’sinden sunuluyor — böylece kritik kararlar geri alınmıyor.</w:t>
       </w:r>
     </w:p>
     <w:p>
@@ -4605,9 +4671,9 @@
       <w:pPr>
         <w:pStyle w:val="Heading2"/>
       </w:pPr>
-      <w:bookmarkStart w:id="38" w:name="slayt-17-bitiş-hepsi-neye-varıyor"/>
-      <w:r>
-        <w:t xml:space="preserve">Slayt 17 — Bitiş: hepsi neye varıyor</w:t>
+      <w:bookmarkStart w:id="38" w:name="slayt-17-kapanış-hepsi-neye-varıyor"/>
+      <w:r>
+        <w:t xml:space="preserve">Slayt 17 — Kapanış: hepsi neye varıyor</w:t>
       </w:r>
       <w:bookmarkEnd w:id="38"/>
     </w:p>
@@ -4661,7 +4727,7 @@
         <w:rPr>
           <w:b/>
         </w:rPr>
-        <w:t xml:space="preserve">kartı + Slayt 0’daki kahraman hat şeması:</w:t>
+        <w:t xml:space="preserve">kartı + Slayt 0’daki kapak hat şeması:</w:t>
       </w:r>
       <w:r>
         <w:t xml:space="preserve"> </w:t>
@@ -4676,7 +4742,7 @@
         <w:rPr>
           <w:b/>
         </w:rPr>
-        <w:t xml:space="preserve">~31.800 backend satırı · 216 commit · 5.396-satır şema · ~5.600 test satırı · 1.500 → 20/gün kademe · 6 aydır canlı.</w:t>
+        <w:t xml:space="preserve">~31.800 backend satırı · 216 commit · 5.396 satırlık şema · ~5.600 test satırı · 1.500 → 20/gün kademe · 6 aydır canlı.</w:t>
       </w:r>
       <w:r>
         <w:t xml:space="preserve"> </w:t>
@@ -4694,7 +4760,7 @@
         <w:t xml:space="preserve">“</w:t>
       </w:r>
       <w:r>
-        <w:t xml:space="preserve">Üretimde işletildi, migrate edildi ve kurtarıldı — ücretsiz altyapıda.</w:t>
+        <w:t xml:space="preserve">Üretimde işletildi, taşındı ve kurtarıldı — hem de ücretsiz altyapıda.</w:t>
       </w:r>
       <w:r>
         <w:t xml:space="preserve">”</w:t>
@@ -4733,16 +4799,16 @@
         <w:t xml:space="preserve"> </w:t>
       </w:r>
       <w:r>
-        <w:t xml:space="preserve">backend/ops/şema; tek başına veritabanı sözleşmesi</w:t>
-      </w:r>
-      <w:r>
-        <w:t xml:space="preserve"> </w:t>
-      </w:r>
-      <w:r>
-        <w:rPr>
-          <w:b/>
-        </w:rPr>
-        <w:t xml:space="preserve">5.396 satırdır</w:t>
+        <w:t xml:space="preserve">backend/operasyon/şema; yalnızca veritabanı sözleşmesi</w:t>
+      </w:r>
+      <w:r>
+        <w:t xml:space="preserve"> </w:t>
+      </w:r>
+      <w:r>
+        <w:rPr>
+          <w:b/>
+        </w:rPr>
+        <w:t xml:space="preserve">5.396 satır</w:t>
       </w:r>
       <w:r>
         <w:t xml:space="preserve"> </w:t>
@@ -4763,7 +4829,7 @@
         <w:t xml:space="preserve"> </w:t>
       </w:r>
       <w:r>
-        <w:t xml:space="preserve">sabitlenmiştir.</w:t>
+        <w:t xml:space="preserve">sabitlenmiş.</w:t>
       </w:r>
     </w:p>
     <w:p>
@@ -4775,16 +4841,16 @@
         <w:pStyle w:val="Compact"/>
       </w:pPr>
       <w:r>
-        <w:t xml:space="preserve">Günde ~1.500 eleyip en iyi ~20’yi çıkaran bir</w:t>
-      </w:r>
-      <w:r>
-        <w:t xml:space="preserve"> </w:t>
-      </w:r>
-      <w:r>
-        <w:rPr>
-          <w:b/>
-        </w:rPr>
-        <w:t xml:space="preserve">üç-modelli kademe</w:t>
+        <w:t xml:space="preserve">Günde ~1.500 makaleyi eleyip en iyi ~20’sini çıkaran bir</w:t>
+      </w:r>
+      <w:r>
+        <w:t xml:space="preserve"> </w:t>
+      </w:r>
+      <w:r>
+        <w:rPr>
+          <w:b/>
+        </w:rPr>
+        <w:t xml:space="preserve">üç modelli kademe</w:t>
       </w:r>
       <w:r>
         <w:t xml:space="preserve">; çıktısı bir insanınkiyle</w:t>
@@ -4796,7 +4862,7 @@
         <w:rPr>
           <w:b/>
         </w:rPr>
-        <w:t xml:space="preserve">birebir aynı hash’lenen</w:t>
+        <w:t xml:space="preserve">aynı hash’i üreten</w:t>
       </w:r>
       <w:r>
         <w:t xml:space="preserve"> </w:t>
@@ -4814,7 +4880,7 @@
         <w:t xml:space="preserve">deterministik normalleştirici</w:t>
       </w:r>
       <w:r>
-        <w:t xml:space="preserve">; ve güveniliri otomatik tutan, belirsizi insana yönlendiren ve geri kalanın örneklenen bir dilimini denetleyen bir</w:t>
+        <w:t xml:space="preserve">; ve güveniliri otomatik tutan, belirsizi insana yönlendiren, geri kalanın da örneklenmiş bir kısmını denetleyen bir</w:t>
       </w:r>
       <w:r>
         <w:t xml:space="preserve"> </w:t>
@@ -4838,7 +4904,7 @@
         <w:pStyle w:val="Compact"/>
       </w:pPr>
       <w:r>
-        <w:t xml:space="preserve">Bot-duvarlarını bir proof-of-work çözücüyle yenen bir</w:t>
+        <w:t xml:space="preserve">Bot duvarlarını bir proof-of-work çözücüyle aşan bir</w:t>
       </w:r>
       <w:r>
         <w:t xml:space="preserve"> </w:t>
@@ -4865,7 +4931,7 @@
         <w:t xml:space="preserve"> </w:t>
       </w:r>
       <w:r>
-        <w:t xml:space="preserve">ve hepsini 5 dakikalık bir cron’da Supabase + Gemini ücretsiz katmanları içinde çalıştıran bir</w:t>
+        <w:t xml:space="preserve">ve hepsini beş dakikalık bir cron’da Supabase + Gemini’nin ücretsiz katmanlarında çalıştıran bir</w:t>
       </w:r>
       <w:r>
         <w:t xml:space="preserve"> </w:t>
@@ -4892,19 +4958,19 @@
         <w:rPr>
           <w:b/>
         </w:rPr>
-        <w:t xml:space="preserve">Prototip değil — altı ay boyunca canlı, işletildi/migrate edildi/kurtarıldı</w:t>
-      </w:r>
-      <w:r>
-        <w:t xml:space="preserve">, bozuk bir politikanın veri sızdıracağı ve yanlış bir otomatik-kabulün bir veritabanını bozacağı bir yerde, bu yüzden her biri olmayacak şekilde tasarlandı.</w:t>
-      </w:r>
-      <w:r>
-        <w:t xml:space="preserve"> </w:t>
-      </w:r>
-      <w:r>
-        <w:rPr>
-          <w:b/>
-        </w:rPr>
-        <w:t xml:space="preserve">Benim backend’im, makaleleri bulan, onları okuyan, neyin güvenilir olduğuna karar veren ve yalnızca geri kalanını bir insana saklayan makine — her gün çalışacak kadar ucuz, bir besin etiketinde güvenilecek kadar dürüst.</w:t>
+        <w:t xml:space="preserve">Prototip değil — altı aydır canlı, işletildi/taşındı/kurtarıldı</w:t>
+      </w:r>
+      <w:r>
+        <w:t xml:space="preserve">; hatalı bir politikanın veri sızdıracağı ve yanlış bir otomatik kabulün bir veritabanını bozacağı bir ortamda, bu yüzden her biri olmayacak şekilde tasarlandı.</w:t>
+      </w:r>
+      <w:r>
+        <w:t xml:space="preserve"> </w:t>
+      </w:r>
+      <w:r>
+        <w:rPr>
+          <w:b/>
+        </w:rPr>
+        <w:t xml:space="preserve">Benim backend’im, makaleleri bulan, onları okuyan, neyin güvenilir olduğuna karar veren ve yalnızca geri kalanı bir insana bırakan makine — her gün çalışacak kadar ucuz, bir besin etiketinde güvenilecek kadar dürüst.</w:t>
       </w:r>
     </w:p>
     <w:sectPr/>

</xml_diff>